<commit_message>
Ready to release (all remarks taken into account)
</commit_message>
<xml_diff>
--- a/deliverables/1 search offers/Search for offers - to do list.docx
+++ b/deliverables/1 search offers/Search for offers - to do list.docx
@@ -103,13 +103,7 @@
         <w:rPr>
           <w:lang w:val="en-US"/>
         </w:rPr>
-        <w:t>E</w:t>
-      </w:r>
-      <w:r>
-        <w:rPr>
-          <w:lang w:val="en-US"/>
-        </w:rPr>
-        <w:t>dwinvandenbelt</w:t>
+        <w:t>Edwinvandenbelt</w:t>
       </w:r>
       <w:proofErr w:type="spellEnd"/>
       <w:r>
@@ -163,31 +157,16 @@
         <w:rPr>
           <w:lang w:val="en-US"/>
         </w:rPr>
-        <w:t xml:space="preserve"> want to extend </w:t>
-      </w:r>
-      <w:proofErr w:type="gramStart"/>
-      <w:r>
-        <w:rPr>
-          <w:lang w:val="en-US"/>
-        </w:rPr>
-        <w:t>it</w:t>
-      </w:r>
-      <w:proofErr w:type="gramEnd"/>
-      <w:r>
-        <w:rPr>
-          <w:lang w:val="en-US"/>
-        </w:rPr>
-        <w:t>, they can, after notifying the OTI governance body.</w:t>
-      </w:r>
-    </w:p>
-    <w:p>
-      <w:pPr>
-        <w:rPr>
-          <w:lang w:val="en-US"/>
-        </w:rPr>
-      </w:pPr>
-      <w:proofErr w:type="spellStart"/>
-      <w:proofErr w:type="gramStart"/>
+        <w:t xml:space="preserve"> want to extend it, they can, after notifying the OTI governance body.</w:t>
+      </w:r>
+    </w:p>
+    <w:p>
+      <w:pPr>
+        <w:rPr>
+          <w:lang w:val="en-US"/>
+        </w:rPr>
+      </w:pPr>
+      <w:proofErr w:type="spellStart"/>
       <w:r>
         <w:rPr>
           <w:lang w:val="en-US"/>
@@ -199,14 +178,7 @@
         <w:rPr>
           <w:lang w:val="en-US"/>
         </w:rPr>
-        <w:t xml:space="preserve"> :</w:t>
-      </w:r>
-      <w:proofErr w:type="gramEnd"/>
-      <w:r>
-        <w:rPr>
-          <w:lang w:val="en-US"/>
-        </w:rPr>
-        <w:t xml:space="preserve"> </w:t>
+        <w:t xml:space="preserve"> : </w:t>
       </w:r>
       <w:r>
         <w:rPr>
@@ -226,21 +198,7 @@
         <w:rPr>
           <w:lang w:val="en-US"/>
         </w:rPr>
-        <w:t xml:space="preserve"> by size of the animal as it often </w:t>
-      </w:r>
-      <w:proofErr w:type="gramStart"/>
-      <w:r>
-        <w:rPr>
-          <w:lang w:val="en-US"/>
-        </w:rPr>
-        <w:t>as</w:t>
-      </w:r>
-      <w:proofErr w:type="gramEnd"/>
-      <w:r>
-        <w:rPr>
-          <w:lang w:val="en-US"/>
-        </w:rPr>
-        <w:t xml:space="preserve"> more impact of the footprint of a travelling entity</w:t>
+        <w:t xml:space="preserve"> by size of the animal as it often as more impact of the footprint of a travelling entity</w:t>
       </w:r>
     </w:p>
     <w:p>
@@ -279,13 +237,7 @@
         <w:rPr>
           <w:lang w:val="en-US"/>
         </w:rPr>
-        <w:t>E</w:t>
-      </w:r>
-      <w:r>
-        <w:rPr>
-          <w:lang w:val="en-US"/>
-        </w:rPr>
-        <w:t>inarbjorkevoll</w:t>
+        <w:t>Einarbjorkevoll</w:t>
       </w:r>
       <w:proofErr w:type="spellEnd"/>
       <w:r>
@@ -361,112 +313,34 @@
         <w:rPr>
           <w:lang w:val="en-US"/>
         </w:rPr>
-        <w:t xml:space="preserve">I don't see where to give information on NFC smartcard held by a passenger. It is not a </w:t>
-      </w:r>
-      <w:proofErr w:type="gramStart"/>
-      <w:r>
-        <w:rPr>
-          <w:lang w:val="en-US"/>
-        </w:rPr>
-        <w:t>mean</w:t>
-      </w:r>
-      <w:proofErr w:type="gramEnd"/>
-      <w:r>
-        <w:rPr>
-          <w:lang w:val="en-US"/>
-        </w:rPr>
-        <w:t xml:space="preserve"> </w:t>
-      </w:r>
-      <w:proofErr w:type="gramStart"/>
-      <w:r>
-        <w:rPr>
-          <w:lang w:val="en-US"/>
-        </w:rPr>
-        <w:t>to get reduced</w:t>
-      </w:r>
-      <w:proofErr w:type="gramEnd"/>
-      <w:r>
-        <w:rPr>
-          <w:lang w:val="en-US"/>
-        </w:rPr>
-        <w:t xml:space="preserve"> or additional offer. thus:</w:t>
-      </w:r>
-    </w:p>
-    <w:p>
-      <w:pPr>
-        <w:rPr>
-          <w:lang w:val="en-US"/>
-        </w:rPr>
-      </w:pPr>
-      <w:r>
-        <w:rPr>
-          <w:lang w:val="en-US"/>
-        </w:rPr>
-        <w:t xml:space="preserve">either generalize this area with any object held by a traveller that could </w:t>
-      </w:r>
-      <w:proofErr w:type="gramStart"/>
-      <w:r>
-        <w:rPr>
-          <w:lang w:val="en-US"/>
-        </w:rPr>
-        <w:t>impact</w:t>
-      </w:r>
-      <w:proofErr w:type="gramEnd"/>
-      <w:r>
-        <w:rPr>
-          <w:lang w:val="en-US"/>
-        </w:rPr>
-        <w:t xml:space="preserve"> the distribution (not only a </w:t>
-      </w:r>
-      <w:proofErr w:type="gramStart"/>
-      <w:r>
-        <w:rPr>
-          <w:lang w:val="en-US"/>
-        </w:rPr>
-        <w:t>mean</w:t>
-      </w:r>
-      <w:proofErr w:type="gramEnd"/>
-      <w:r>
-        <w:rPr>
-          <w:lang w:val="en-US"/>
-        </w:rPr>
-        <w:t xml:space="preserve"> to get a reduced or additional offer).</w:t>
-      </w:r>
-    </w:p>
-    <w:p>
-      <w:pPr>
-        <w:rPr>
-          <w:lang w:val="en-US"/>
-        </w:rPr>
-      </w:pPr>
-      <w:r>
-        <w:rPr>
-          <w:lang w:val="en-US"/>
-        </w:rPr>
-        <w:t xml:space="preserve">or create a dedicated object around fulfilment device held by the traveller (NFC card, ID of </w:t>
-      </w:r>
-      <w:proofErr w:type="gramStart"/>
-      <w:r>
-        <w:rPr>
-          <w:lang w:val="en-US"/>
-        </w:rPr>
-        <w:t>a</w:t>
-      </w:r>
-      <w:proofErr w:type="gramEnd"/>
-      <w:r>
-        <w:rPr>
-          <w:lang w:val="en-US"/>
-        </w:rPr>
-        <w:t xml:space="preserve"> enrolled smartphone</w:t>
-      </w:r>
-      <w:proofErr w:type="gramStart"/>
-      <w:r>
-        <w:rPr>
-          <w:lang w:val="en-US"/>
-        </w:rPr>
-        <w:t>)</w:t>
-      </w:r>
-      <w:proofErr w:type="gramEnd"/>
+        <w:t>I don't see where to give information on NFC smartcard held by a passenger. It is not a mean to get reduced or additional offer. thus:</w:t>
+      </w:r>
+    </w:p>
+    <w:p>
+      <w:pPr>
+        <w:rPr>
+          <w:lang w:val="en-US"/>
+        </w:rPr>
+      </w:pPr>
+      <w:r>
+        <w:rPr>
+          <w:lang w:val="en-US"/>
+        </w:rPr>
+        <w:t>either generalize this area with any object held by a traveller that could impact the distribution (not only a mean to get a reduced or additional offer).</w:t>
+      </w:r>
+    </w:p>
+    <w:p>
+      <w:pPr>
+        <w:rPr>
+          <w:lang w:val="en-US"/>
+        </w:rPr>
+      </w:pPr>
+      <w:r>
+        <w:rPr>
+          <w:lang w:val="en-US"/>
+        </w:rPr>
+        <w:t>or create a dedicated object around fulfilment device held by the traveller (NFC card, ID of a enrolled smartphone)</w:t>
+      </w:r>
     </w:p>
     <w:p>
       <w:pPr>
@@ -490,21 +364,7 @@
         <w:rPr>
           <w:lang w:val="en-US"/>
         </w:rPr>
-        <w:t xml:space="preserve">To support card based and </w:t>
-      </w:r>
-      <w:proofErr w:type="gramStart"/>
-      <w:r>
-        <w:rPr>
-          <w:lang w:val="en-US"/>
-        </w:rPr>
-        <w:t>account based</w:t>
-      </w:r>
-      <w:proofErr w:type="gramEnd"/>
-      <w:r>
-        <w:rPr>
-          <w:lang w:val="en-US"/>
-        </w:rPr>
-        <w:t xml:space="preserve"> ticketing the card details are necessary from the beginning, optionally also including the card content.</w:t>
+        <w:t>To support card based and account based ticketing the card details are necessary from the beginning, optionally also including the card content.</w:t>
       </w:r>
     </w:p>
     <w:p>
@@ -593,21 +453,7 @@
         <w:rPr>
           <w:lang w:val="en-US"/>
         </w:rPr>
-        <w:t xml:space="preserve">Number and issuer are needed to identify a travel </w:t>
-      </w:r>
-      <w:proofErr w:type="gramStart"/>
-      <w:r>
-        <w:rPr>
-          <w:lang w:val="en-US"/>
-        </w:rPr>
-        <w:t>account,</w:t>
-      </w:r>
-      <w:proofErr w:type="gramEnd"/>
-      <w:r>
-        <w:rPr>
-          <w:lang w:val="en-US"/>
-        </w:rPr>
-        <w:t xml:space="preserve"> the code identifies a reduction card.</w:t>
+        <w:t>Number and issuer are needed to identify a travel account, the code identifies a reduction card.</w:t>
       </w:r>
     </w:p>
     <w:p>
@@ -802,21 +648,7 @@
         <w:rPr>
           <w:lang w:val="en-US"/>
         </w:rPr>
-        <w:t>$ref</w:t>
-      </w:r>
-      <w:proofErr w:type="gramStart"/>
-      <w:r>
-        <w:rPr>
-          <w:lang w:val="en-US"/>
-        </w:rPr>
-        <w:t>: '#/</w:t>
-      </w:r>
-      <w:proofErr w:type="gramEnd"/>
-      <w:r>
-        <w:rPr>
-          <w:lang w:val="en-US"/>
-        </w:rPr>
-        <w:t>components/schemas/</w:t>
+        <w:t>$ref: '#/components/schemas/</w:t>
       </w:r>
       <w:proofErr w:type="spellStart"/>
       <w:r>
@@ -856,21 +688,7 @@
         <w:rPr>
           <w:lang w:val="en-US"/>
         </w:rPr>
-        <w:t>$ref</w:t>
-      </w:r>
-      <w:proofErr w:type="gramStart"/>
-      <w:r>
-        <w:rPr>
-          <w:lang w:val="en-US"/>
-        </w:rPr>
-        <w:t>: '#/</w:t>
-      </w:r>
-      <w:proofErr w:type="gramEnd"/>
-      <w:r>
-        <w:rPr>
-          <w:lang w:val="en-US"/>
-        </w:rPr>
-        <w:t>components/schemas/</w:t>
+        <w:t>$ref: '#/components/schemas/</w:t>
       </w:r>
       <w:proofErr w:type="spellStart"/>
       <w:r>
@@ -1099,21 +917,7 @@
         <w:rPr>
           <w:lang w:val="en-US"/>
         </w:rPr>
-        <w:t xml:space="preserve">The travel account number </w:t>
-      </w:r>
-      <w:proofErr w:type="gramStart"/>
-      <w:r>
-        <w:rPr>
-          <w:lang w:val="en-US"/>
-        </w:rPr>
-        <w:t>need</w:t>
-      </w:r>
-      <w:proofErr w:type="gramEnd"/>
-      <w:r>
-        <w:rPr>
-          <w:lang w:val="en-US"/>
-        </w:rPr>
-        <w:t xml:space="preserve"> to be split into a personal account id and the account agreement id to cover separate account ids like using a credit card hash as account id.</w:t>
+        <w:t>The travel account number need to be split into a personal account id and the account agreement id to cover separate account ids like using a credit card hash as account id.</w:t>
       </w:r>
     </w:p>
     <w:p>
@@ -1221,13 +1025,7 @@
         <w:rPr>
           <w:lang w:val="en-US"/>
         </w:rPr>
-        <w:t>E</w:t>
-      </w:r>
-      <w:r>
-        <w:rPr>
-          <w:lang w:val="en-US"/>
-        </w:rPr>
-        <w:t>dwinvandenbelt</w:t>
+        <w:t>Edwinvandenbelt</w:t>
       </w:r>
       <w:proofErr w:type="spellEnd"/>
       <w:r>
@@ -1276,19 +1074,11 @@
           <w:lang w:val="en-US"/>
         </w:rPr>
       </w:pPr>
-      <w:proofErr w:type="gramStart"/>
-      <w:r>
-        <w:rPr>
-          <w:lang w:val="en-US"/>
-        </w:rPr>
-        <w:t>{ "</w:t>
-      </w:r>
-      <w:proofErr w:type="gramEnd"/>
-      <w:r>
-        <w:rPr>
-          <w:lang w:val="en-US"/>
-        </w:rPr>
-        <w:t>issuer": "NS", "</w:t>
+      <w:r>
+        <w:rPr>
+          <w:lang w:val="en-US"/>
+        </w:rPr>
+        <w:t>{ "issuer": "NS", "</w:t>
       </w:r>
       <w:proofErr w:type="spellStart"/>
       <w:r>
@@ -1302,30 +1092,8 @@
         <w:rPr>
           <w:lang w:val="en-US"/>
         </w:rPr>
-        <w:t>": "voucher", "channel": "</w:t>
-      </w:r>
-      <w:proofErr w:type="gramStart"/>
-      <w:r>
-        <w:rPr>
-          <w:lang w:val="en-US"/>
-        </w:rPr>
-        <w:t>National museum</w:t>
-      </w:r>
-      <w:proofErr w:type="gramEnd"/>
-      <w:r>
-        <w:rPr>
-          <w:lang w:val="en-US"/>
-        </w:rPr>
-        <w:t>", "code": "SUMMER26</w:t>
-      </w:r>
-      <w:proofErr w:type="gramStart"/>
-      <w:r>
-        <w:rPr>
-          <w:lang w:val="en-US"/>
-        </w:rPr>
-        <w:t>" }</w:t>
-      </w:r>
-      <w:proofErr w:type="gramEnd"/>
+        <w:t>": "voucher", "channel": "National museum", "code": "SUMMER26" }</w:t>
+      </w:r>
     </w:p>
     <w:p>
       <w:pPr>
@@ -1382,13 +1150,7 @@
         <w:rPr>
           <w:lang w:val="en-US"/>
         </w:rPr>
-        <w:t>E</w:t>
-      </w:r>
-      <w:r>
-        <w:rPr>
-          <w:lang w:val="en-US"/>
-        </w:rPr>
-        <w:t>dwinvandenbelt</w:t>
+        <w:t>Edwinvandenbelt</w:t>
       </w:r>
       <w:proofErr w:type="spellEnd"/>
       <w:r>
@@ -1457,13 +1219,7 @@
         <w:rPr>
           <w:lang w:val="en-US"/>
         </w:rPr>
-        <w:t>E</w:t>
-      </w:r>
-      <w:r>
-        <w:rPr>
-          <w:lang w:val="en-US"/>
-        </w:rPr>
-        <w:t>dwinvandenbelt</w:t>
+        <w:t>Edwinvandenbelt</w:t>
       </w:r>
       <w:proofErr w:type="spellEnd"/>
       <w:r>
@@ -1663,7 +1419,6 @@
         <w:t xml:space="preserve">). But how to cope with the bike rental (you travel, but you come -in most cases- back to the departure location)? Is it a leg or is </w:t>
       </w:r>
       <w:proofErr w:type="spellStart"/>
-      <w:proofErr w:type="gramStart"/>
       <w:r>
         <w:rPr>
           <w:lang w:val="en-US"/>
@@ -1671,7 +1426,6 @@
         <w:t>is</w:t>
       </w:r>
       <w:proofErr w:type="spellEnd"/>
-      <w:proofErr w:type="gramEnd"/>
       <w:r>
         <w:rPr>
           <w:lang w:val="en-US"/>
@@ -2054,7 +1808,6 @@
         <w:t xml:space="preserve">regional traffic often uses line numbers instead of train numbers. To be multimodal it should be named </w:t>
       </w:r>
       <w:proofErr w:type="spellStart"/>
-      <w:proofErr w:type="gramStart"/>
       <w:r>
         <w:rPr>
           <w:lang w:val="en-US"/>
@@ -2062,7 +1815,6 @@
         <w:t>vehicleNumbers</w:t>
       </w:r>
       <w:proofErr w:type="spellEnd"/>
-      <w:proofErr w:type="gramEnd"/>
       <w:r>
         <w:rPr>
           <w:lang w:val="en-US"/>
@@ -2150,13 +1902,7 @@
         <w:rPr>
           <w:lang w:val="en-US"/>
         </w:rPr>
-        <w:t>E</w:t>
-      </w:r>
-      <w:r>
-        <w:rPr>
-          <w:lang w:val="en-US"/>
-        </w:rPr>
-        <w:t>dwinvandenbelt</w:t>
+        <w:t>Edwinvandenbelt</w:t>
       </w:r>
       <w:proofErr w:type="spellEnd"/>
       <w:r>
@@ -2372,6 +2118,7 @@
         <w:rPr>
           <w:i/>
           <w:iCs/>
+          <w:lang w:val="en-US"/>
         </w:rPr>
       </w:pPr>
       <w:r>
@@ -2386,6 +2133,7 @@
         <w:rPr>
           <w:i/>
           <w:iCs/>
+          <w:lang w:val="en-US"/>
         </w:rPr>
         <w:t>- ANY_CLASS</w:t>
       </w:r>
@@ -2459,19 +2207,11 @@
         </w:rPr>
         <w:t xml:space="preserve">Level of detail is </w:t>
       </w:r>
-      <w:proofErr w:type="gramStart"/>
-      <w:r>
-        <w:rPr>
-          <w:lang w:val="en-US"/>
-        </w:rPr>
-        <w:t>different,</w:t>
-      </w:r>
-      <w:proofErr w:type="gramEnd"/>
-      <w:r>
-        <w:rPr>
-          <w:lang w:val="en-US"/>
-        </w:rPr>
-        <w:t xml:space="preserve"> I personally think that the leg should be a subclass of the </w:t>
+      <w:r>
+        <w:rPr>
+          <w:lang w:val="en-US"/>
+        </w:rPr>
+        <w:t xml:space="preserve">different, I personally think that the leg should be a subclass of the </w:t>
       </w:r>
       <w:proofErr w:type="spellStart"/>
       <w:r>
@@ -2531,57 +2271,1559 @@
         <w:rPr>
           <w:lang w:val="en-US"/>
         </w:rPr>
+        <w:t xml:space="preserve">: The list of trip sections for the offers is missing in the </w:t>
+      </w:r>
+      <w:proofErr w:type="spellStart"/>
+      <w:r>
+        <w:rPr>
+          <w:lang w:val="en-US"/>
+        </w:rPr>
+        <w:t>SearchOfferFilters</w:t>
+      </w:r>
+      <w:proofErr w:type="spellEnd"/>
+    </w:p>
+    <w:p>
+      <w:pPr>
+        <w:rPr>
+          <w:lang w:val="en-US"/>
+        </w:rPr>
+      </w:pPr>
+      <w:proofErr w:type="spellStart"/>
+      <w:r>
+        <w:rPr>
+          <w:lang w:val="en-US"/>
+        </w:rPr>
+        <w:t>Edwinvandenbelt</w:t>
+      </w:r>
+      <w:proofErr w:type="spellEnd"/>
+      <w:r>
+        <w:rPr>
+          <w:lang w:val="en-US"/>
+        </w:rPr>
+        <w:t xml:space="preserve">: it is now directly in the </w:t>
+      </w:r>
+      <w:proofErr w:type="spellStart"/>
+      <w:r>
+        <w:rPr>
+          <w:lang w:val="en-US"/>
+        </w:rPr>
+        <w:t>searchofferrequest</w:t>
+      </w:r>
+      <w:proofErr w:type="spellEnd"/>
+      <w:r>
+        <w:rPr>
+          <w:lang w:val="en-US"/>
+        </w:rPr>
+        <w:t>. Discuss.</w:t>
+      </w:r>
+    </w:p>
+    <w:p>
+      <w:pPr>
+        <w:rPr>
+          <w:lang w:val="en-US"/>
+        </w:rPr>
+      </w:pPr>
+    </w:p>
+    <w:p>
+      <w:pPr>
+        <w:pStyle w:val="Kop1"/>
+        <w:rPr>
+          <w:lang w:val="en-US"/>
+        </w:rPr>
+      </w:pPr>
+      <w:r>
+        <w:rPr>
+          <w:lang w:val="en-US"/>
+        </w:rPr>
+        <w:t>RESPONSE</w:t>
+      </w:r>
+    </w:p>
+    <w:p>
+      <w:pPr>
+        <w:rPr>
+          <w:b/>
+          <w:bCs/>
+          <w:lang w:val="en-US"/>
+        </w:rPr>
+      </w:pPr>
+      <w:r>
+        <w:rPr>
+          <w:b/>
+          <w:bCs/>
+          <w:lang w:val="en-US"/>
+        </w:rPr>
+        <w:t>Package (element) states</w:t>
+      </w:r>
+    </w:p>
+    <w:p>
+      <w:pPr>
+        <w:rPr>
+          <w:lang w:val="en-US"/>
+        </w:rPr>
+      </w:pPr>
+      <w:r>
+        <w:rPr>
+          <w:lang w:val="en-US"/>
+        </w:rPr>
+        <w:t xml:space="preserve">CGantert345: </w:t>
+      </w:r>
+      <w:r>
+        <w:rPr>
+          <w:lang w:val="en-US"/>
+        </w:rPr>
+        <w:t>OSDM covers these states of PACKAGE ELEMENTs. How do they relate to OTI?</w:t>
+      </w:r>
+    </w:p>
+    <w:p>
+      <w:pPr>
+        <w:rPr>
+          <w:lang w:val="en-US"/>
+        </w:rPr>
+      </w:pPr>
+      <w:r>
+        <w:rPr>
+          <w:lang w:val="en-US"/>
+        </w:rPr>
+        <w:t>#0"PREBOOKED"</w:t>
+      </w:r>
+      <w:r>
+        <w:rPr>
+          <w:lang w:val="en-US"/>
+        </w:rPr>
+        <w:br/>
+      </w:r>
+      <w:hyperlink r:id="rId6" w:history="1">
+        <w:r>
+          <w:rPr>
+            <w:rStyle w:val="Hyperlink"/>
+            <w:lang w:val="en-US"/>
+          </w:rPr>
+          <w:t>#1</w:t>
+        </w:r>
+      </w:hyperlink>
+      <w:r>
+        <w:rPr>
+          <w:lang w:val="en-US"/>
+        </w:rPr>
+        <w:t>"ON_HOLD"</w:t>
+      </w:r>
+      <w:r>
+        <w:rPr>
+          <w:lang w:val="en-US"/>
+        </w:rPr>
+        <w:br/>
+      </w:r>
+      <w:hyperlink r:id="rId7" w:history="1">
+        <w:r>
+          <w:rPr>
+            <w:rStyle w:val="Hyperlink"/>
+            <w:lang w:val="en-US"/>
+          </w:rPr>
+          <w:t>#2</w:t>
+        </w:r>
+      </w:hyperlink>
+      <w:r>
+        <w:rPr>
+          <w:lang w:val="en-US"/>
+        </w:rPr>
+        <w:t>"CONFIRMED"</w:t>
+      </w:r>
+      <w:r>
+        <w:rPr>
+          <w:lang w:val="en-US"/>
+        </w:rPr>
+        <w:br/>
+      </w:r>
+      <w:hyperlink r:id="rId8" w:history="1">
+        <w:r>
+          <w:rPr>
+            <w:rStyle w:val="Hyperlink"/>
+            <w:lang w:val="en-US"/>
+          </w:rPr>
+          <w:t>#3</w:t>
+        </w:r>
+      </w:hyperlink>
+      <w:r>
+        <w:rPr>
+          <w:lang w:val="en-US"/>
+        </w:rPr>
+        <w:t>"FULFILLED"</w:t>
+      </w:r>
+      <w:r>
+        <w:rPr>
+          <w:lang w:val="en-US"/>
+        </w:rPr>
+        <w:br/>
+      </w:r>
+      <w:hyperlink r:id="rId9" w:history="1">
+        <w:r>
+          <w:rPr>
+            <w:rStyle w:val="Hyperlink"/>
+            <w:lang w:val="en-US"/>
+          </w:rPr>
+          <w:t>#4</w:t>
+        </w:r>
+      </w:hyperlink>
+      <w:r>
+        <w:rPr>
+          <w:lang w:val="en-US"/>
+        </w:rPr>
+        <w:t>"CANCELLED"</w:t>
+      </w:r>
+      <w:r>
+        <w:rPr>
+          <w:lang w:val="en-US"/>
+        </w:rPr>
+        <w:br/>
+      </w:r>
+      <w:hyperlink r:id="rId10" w:history="1">
+        <w:r>
+          <w:rPr>
+            <w:rStyle w:val="Hyperlink"/>
+            <w:lang w:val="en-US"/>
+          </w:rPr>
+          <w:t>#5</w:t>
+        </w:r>
+      </w:hyperlink>
+      <w:r>
+        <w:rPr>
+          <w:lang w:val="en-US"/>
+        </w:rPr>
+        <w:t>"RELEASED"</w:t>
+      </w:r>
+      <w:r>
+        <w:rPr>
+          <w:lang w:val="en-US"/>
+        </w:rPr>
+        <w:br/>
+      </w:r>
+      <w:hyperlink r:id="rId11" w:history="1">
+        <w:r>
+          <w:rPr>
+            <w:rStyle w:val="Hyperlink"/>
+            <w:lang w:val="en-US"/>
+          </w:rPr>
+          <w:t>#6</w:t>
+        </w:r>
+      </w:hyperlink>
+      <w:r>
+        <w:rPr>
+          <w:lang w:val="en-US"/>
+        </w:rPr>
+        <w:t>"REFUNDED"</w:t>
+      </w:r>
+      <w:r>
+        <w:rPr>
+          <w:lang w:val="en-US"/>
+        </w:rPr>
+        <w:br/>
+      </w:r>
+      <w:hyperlink r:id="rId12" w:history="1">
+        <w:r>
+          <w:rPr>
+            <w:rStyle w:val="Hyperlink"/>
+            <w:lang w:val="en-US"/>
+          </w:rPr>
+          <w:t>#7</w:t>
+        </w:r>
+      </w:hyperlink>
+      <w:r>
+        <w:rPr>
+          <w:lang w:val="en-US"/>
+        </w:rPr>
+        <w:t>"EXCHANGE_ONGOING"</w:t>
+      </w:r>
+      <w:r>
+        <w:rPr>
+          <w:lang w:val="en-US"/>
+        </w:rPr>
+        <w:br/>
+      </w:r>
+      <w:hyperlink r:id="rId13" w:history="1">
+        <w:r>
+          <w:rPr>
+            <w:rStyle w:val="Hyperlink"/>
+            <w:lang w:val="en-US"/>
+          </w:rPr>
+          <w:t>#8</w:t>
+        </w:r>
+      </w:hyperlink>
+      <w:r>
+        <w:rPr>
+          <w:lang w:val="en-US"/>
+        </w:rPr>
+        <w:t>"EXCHANGED"</w:t>
+      </w:r>
+      <w:r>
+        <w:rPr>
+          <w:lang w:val="en-US"/>
+        </w:rPr>
+        <w:br/>
+      </w:r>
+      <w:hyperlink r:id="rId14" w:history="1">
+        <w:r>
+          <w:rPr>
+            <w:rStyle w:val="Hyperlink"/>
+            <w:lang w:val="en-US"/>
+          </w:rPr>
+          <w:t>#9</w:t>
+        </w:r>
+      </w:hyperlink>
+      <w:r>
+        <w:rPr>
+          <w:lang w:val="en-US"/>
+        </w:rPr>
+        <w:t>"ERROR"</w:t>
+      </w:r>
+    </w:p>
+    <w:p>
+      <w:pPr>
+        <w:rPr>
+          <w:lang w:val="en-US"/>
+        </w:rPr>
+      </w:pPr>
+      <w:r>
+        <w:rPr>
+          <w:lang w:val="en-US"/>
+        </w:rPr>
+        <w:t>Prebooked -&gt; locked</w:t>
+      </w:r>
+    </w:p>
+    <w:p>
+      <w:pPr>
+        <w:rPr>
+          <w:lang w:val="en-US"/>
+        </w:rPr>
+      </w:pPr>
+      <w:proofErr w:type="spellStart"/>
+      <w:r>
+        <w:rPr>
+          <w:lang w:val="en-US"/>
+        </w:rPr>
+        <w:t>On_hold</w:t>
+      </w:r>
+      <w:proofErr w:type="spellEnd"/>
+      <w:r>
+        <w:rPr>
+          <w:lang w:val="en-US"/>
+        </w:rPr>
+        <w:t xml:space="preserve"> -&gt; ?</w:t>
+      </w:r>
+    </w:p>
+    <w:p>
+      <w:pPr>
+        <w:rPr>
+          <w:lang w:val="en-US"/>
+        </w:rPr>
+      </w:pPr>
+      <w:r>
+        <w:rPr>
+          <w:lang w:val="en-US"/>
+        </w:rPr>
+        <w:t>Confirmed -&gt; purchased</w:t>
+      </w:r>
+    </w:p>
+    <w:p>
+      <w:pPr>
+        <w:rPr>
+          <w:lang w:val="en-US"/>
+        </w:rPr>
+      </w:pPr>
+      <w:r>
+        <w:rPr>
+          <w:lang w:val="en-US"/>
+        </w:rPr>
+        <w:t>Fulfilled -&gt; purchased &amp; fulfilments issued</w:t>
+      </w:r>
+    </w:p>
+    <w:p>
+      <w:pPr>
+        <w:rPr>
+          <w:lang w:val="en-US"/>
+        </w:rPr>
+      </w:pPr>
+      <w:r>
+        <w:rPr>
+          <w:lang w:val="en-US"/>
+        </w:rPr>
+        <w:t>Cancelled -&gt; cancelled</w:t>
+      </w:r>
+    </w:p>
+    <w:p>
+      <w:pPr>
+        <w:rPr>
+          <w:lang w:val="en-US"/>
+        </w:rPr>
+      </w:pPr>
+      <w:r>
+        <w:rPr>
+          <w:lang w:val="en-US"/>
+        </w:rPr>
+        <w:t>Released -&gt; ? Released (from locked state)</w:t>
+      </w:r>
+    </w:p>
+    <w:p>
+      <w:pPr>
+        <w:rPr>
+          <w:lang w:val="en-US"/>
+        </w:rPr>
+      </w:pPr>
+      <w:r>
+        <w:rPr>
+          <w:lang w:val="en-US"/>
+        </w:rPr>
+        <w:lastRenderedPageBreak/>
+        <w:t>Refunded -&gt; not applicable, the refund is a retailer task</w:t>
+      </w:r>
+    </w:p>
+    <w:p>
+      <w:pPr>
+        <w:rPr>
+          <w:lang w:val="en-US"/>
+        </w:rPr>
+      </w:pPr>
+      <w:proofErr w:type="spellStart"/>
+      <w:r>
+        <w:rPr>
+          <w:lang w:val="en-US"/>
+        </w:rPr>
+        <w:t>Exchange_ongoing</w:t>
+      </w:r>
+      <w:proofErr w:type="spellEnd"/>
+      <w:r>
+        <w:rPr>
+          <w:lang w:val="en-US"/>
+        </w:rPr>
+        <w:t xml:space="preserve"> -&gt; after the initiate exchange</w:t>
+      </w:r>
+    </w:p>
+    <w:p>
+      <w:pPr>
+        <w:rPr>
+          <w:lang w:val="en-US"/>
+        </w:rPr>
+      </w:pPr>
+      <w:r>
+        <w:rPr>
+          <w:lang w:val="en-US"/>
+        </w:rPr>
+        <w:t>Exchanged -&gt; a package element is exchanged (is it needed to know it is exchanged or cancelled?)</w:t>
+      </w:r>
+    </w:p>
+    <w:p>
+      <w:pPr>
+        <w:rPr>
+          <w:lang w:val="en-US"/>
+        </w:rPr>
+      </w:pPr>
+      <w:r>
+        <w:rPr>
+          <w:lang w:val="en-US"/>
+        </w:rPr>
+        <w:t>Error -&gt; (internal state?)</w:t>
+      </w:r>
+    </w:p>
+    <w:p>
+      <w:pPr>
+        <w:rPr>
+          <w:lang w:val="en-US"/>
+        </w:rPr>
+      </w:pPr>
+    </w:p>
+    <w:p>
+      <w:pPr>
+        <w:rPr>
+          <w:lang w:val="en-US"/>
+        </w:rPr>
+      </w:pPr>
+      <w:proofErr w:type="spellStart"/>
+      <w:r>
+        <w:rPr>
+          <w:lang w:val="en-US"/>
+        </w:rPr>
+        <w:t>Edwinvandenbelt</w:t>
+      </w:r>
+      <w:proofErr w:type="spellEnd"/>
+      <w:r>
+        <w:rPr>
+          <w:lang w:val="en-US"/>
+        </w:rPr>
         <w:t xml:space="preserve">: </w:t>
       </w:r>
       <w:r>
         <w:rPr>
           <w:lang w:val="en-US"/>
         </w:rPr>
-        <w:t xml:space="preserve">The list of trip sections for the offers is missing in the </w:t>
-      </w:r>
-      <w:proofErr w:type="spellStart"/>
-      <w:r>
-        <w:rPr>
-          <w:lang w:val="en-US"/>
-        </w:rPr>
-        <w:t>SearchOfferFilters</w:t>
-      </w:r>
-      <w:proofErr w:type="spellEnd"/>
-    </w:p>
-    <w:p>
-      <w:pPr>
-        <w:rPr>
-          <w:lang w:val="en-US"/>
-        </w:rPr>
-      </w:pPr>
-      <w:proofErr w:type="spellStart"/>
-      <w:r>
-        <w:rPr>
-          <w:lang w:val="en-US"/>
-        </w:rPr>
-        <w:t>Edwinvandenbelt</w:t>
-      </w:r>
-      <w:proofErr w:type="spellEnd"/>
-      <w:r>
-        <w:rPr>
-          <w:lang w:val="en-US"/>
-        </w:rPr>
-        <w:t xml:space="preserve">: it is now directly in the </w:t>
-      </w:r>
-      <w:proofErr w:type="spellStart"/>
-      <w:r>
-        <w:rPr>
-          <w:lang w:val="en-US"/>
-        </w:rPr>
-        <w:t>searchofferrequest</w:t>
-      </w:r>
-      <w:proofErr w:type="spellEnd"/>
-      <w:r>
-        <w:rPr>
-          <w:lang w:val="en-US"/>
-        </w:rPr>
-        <w:t>. Discuss.</w:t>
-      </w:r>
+        <w:t>Possible states now:</w:t>
+      </w:r>
+    </w:p>
+    <w:p>
+      <w:pPr>
+        <w:rPr>
+          <w:lang w:val="en-US"/>
+        </w:rPr>
+      </w:pPr>
+      <w:r>
+        <w:rPr>
+          <w:lang w:val="en-US"/>
+        </w:rPr>
+        <w:t xml:space="preserve">Offered </w:t>
+      </w:r>
+    </w:p>
+    <w:p>
+      <w:pPr>
+        <w:rPr>
+          <w:lang w:val="en-US"/>
+        </w:rPr>
+      </w:pPr>
+      <w:r>
+        <w:rPr>
+          <w:lang w:val="en-US"/>
+        </w:rPr>
+        <w:t>Locked (+ Non happy flow: Released)</w:t>
+      </w:r>
+    </w:p>
+    <w:p>
+      <w:pPr>
+        <w:rPr>
+          <w:lang w:val="en-US"/>
+        </w:rPr>
+      </w:pPr>
+      <w:r>
+        <w:rPr>
+          <w:lang w:val="en-US"/>
+        </w:rPr>
+        <w:t xml:space="preserve">Validated (after the pre-purchase validation, </w:t>
+      </w:r>
+      <w:proofErr w:type="spellStart"/>
+      <w:r>
+        <w:rPr>
+          <w:lang w:val="en-US"/>
+        </w:rPr>
+        <w:t>non happy</w:t>
+      </w:r>
+      <w:proofErr w:type="spellEnd"/>
+      <w:r>
+        <w:rPr>
+          <w:lang w:val="en-US"/>
+        </w:rPr>
+        <w:t xml:space="preserve"> flow: locked)</w:t>
+      </w:r>
+    </w:p>
+    <w:p>
+      <w:pPr>
+        <w:rPr>
+          <w:lang w:val="en-US"/>
+        </w:rPr>
+      </w:pPr>
+      <w:r>
+        <w:rPr>
+          <w:lang w:val="en-US"/>
+        </w:rPr>
+        <w:t>Purchased (or confirmed, non-happy flow: validated)</w:t>
+      </w:r>
+    </w:p>
+    <w:p>
+      <w:pPr>
+        <w:rPr>
+          <w:lang w:val="en-US"/>
+        </w:rPr>
+      </w:pPr>
+      <w:proofErr w:type="spellStart"/>
+      <w:r>
+        <w:rPr>
+          <w:lang w:val="en-US"/>
+        </w:rPr>
+        <w:t>Cancellation_ongoing</w:t>
+      </w:r>
+      <w:proofErr w:type="spellEnd"/>
+      <w:r>
+        <w:rPr>
+          <w:lang w:val="en-US"/>
+        </w:rPr>
+        <w:t xml:space="preserve"> (after the initiation of the cancellation; non happy: purchased)</w:t>
+      </w:r>
+    </w:p>
+    <w:p>
+      <w:pPr>
+        <w:rPr>
+          <w:lang w:val="en-US"/>
+        </w:rPr>
+      </w:pPr>
+      <w:proofErr w:type="spellStart"/>
+      <w:r>
+        <w:rPr>
+          <w:lang w:val="en-US"/>
+        </w:rPr>
+        <w:t>Exchange</w:t>
+      </w:r>
+      <w:r>
+        <w:rPr>
+          <w:lang w:val="en-US"/>
+        </w:rPr>
+        <w:t>_ongoing</w:t>
+      </w:r>
+      <w:proofErr w:type="spellEnd"/>
+      <w:r>
+        <w:rPr>
+          <w:lang w:val="en-US"/>
+        </w:rPr>
+        <w:t xml:space="preserve"> (after the initiation of the </w:t>
+      </w:r>
+      <w:r>
+        <w:rPr>
+          <w:lang w:val="en-US"/>
+        </w:rPr>
+        <w:t>exchange</w:t>
+      </w:r>
+      <w:r>
+        <w:rPr>
+          <w:lang w:val="en-US"/>
+        </w:rPr>
+        <w:t>; non happy: purchased)</w:t>
+      </w:r>
+    </w:p>
+    <w:p>
+      <w:pPr>
+        <w:rPr>
+          <w:lang w:val="en-US"/>
+        </w:rPr>
+      </w:pPr>
+      <w:r>
+        <w:rPr>
+          <w:lang w:val="en-US"/>
+        </w:rPr>
+        <w:t xml:space="preserve">Cancelled (after a (partial) cancellation + reason!, </w:t>
+      </w:r>
+      <w:proofErr w:type="spellStart"/>
+      <w:r>
+        <w:rPr>
+          <w:lang w:val="en-US"/>
+        </w:rPr>
+        <w:t>non happy</w:t>
+      </w:r>
+      <w:proofErr w:type="spellEnd"/>
+      <w:r>
+        <w:rPr>
+          <w:lang w:val="en-US"/>
+        </w:rPr>
+        <w:t>: purchased)</w:t>
+      </w:r>
+    </w:p>
+    <w:p>
+      <w:pPr>
+        <w:rPr>
+          <w:lang w:val="en-US"/>
+        </w:rPr>
+      </w:pPr>
+      <w:r>
+        <w:rPr>
+          <w:lang w:val="en-US"/>
+        </w:rPr>
+        <w:t>Exchanged</w:t>
+      </w:r>
+      <w:r>
+        <w:rPr>
+          <w:lang w:val="en-US"/>
+        </w:rPr>
+        <w:t xml:space="preserve"> (after a (partial) exchange, </w:t>
+      </w:r>
+      <w:proofErr w:type="spellStart"/>
+      <w:r>
+        <w:rPr>
+          <w:lang w:val="en-US"/>
+        </w:rPr>
+        <w:t>non happy</w:t>
+      </w:r>
+      <w:proofErr w:type="spellEnd"/>
+      <w:r>
+        <w:rPr>
+          <w:lang w:val="en-US"/>
+        </w:rPr>
+        <w:t>: purchased)</w:t>
+      </w:r>
+    </w:p>
+    <w:p>
+      <w:pPr>
+        <w:rPr>
+          <w:b/>
+          <w:bCs/>
+          <w:lang w:val="en-US"/>
+        </w:rPr>
+      </w:pPr>
+    </w:p>
+    <w:p>
+      <w:pPr>
+        <w:rPr>
+          <w:b/>
+          <w:bCs/>
+          <w:lang w:val="en-US"/>
+        </w:rPr>
+      </w:pPr>
+      <w:r>
+        <w:rPr>
+          <w:b/>
+          <w:bCs/>
+          <w:lang w:val="en-US"/>
+        </w:rPr>
+        <w:t>Product</w:t>
+      </w:r>
+      <w:r>
+        <w:rPr>
+          <w:b/>
+          <w:bCs/>
+          <w:lang w:val="en-US"/>
+        </w:rPr>
+        <w:t xml:space="preserve"> definition</w:t>
+      </w:r>
+    </w:p>
+    <w:p>
+      <w:pPr>
+        <w:rPr>
+          <w:lang w:val="en-US"/>
+        </w:rPr>
+      </w:pPr>
+      <w:hyperlink r:id="rId15" w:history="1">
+        <w:r>
+          <w:rPr>
+            <w:rStyle w:val="Hyperlink"/>
+            <w:lang w:val="en-US"/>
+          </w:rPr>
+          <w:t>CGantert345</w:t>
+        </w:r>
+      </w:hyperlink>
+      <w:r>
+        <w:rPr>
+          <w:lang w:val="en-US"/>
+        </w:rPr>
+        <w:t xml:space="preserve">: </w:t>
+      </w:r>
+      <w:r>
+        <w:rPr>
+          <w:lang w:val="en-US"/>
+        </w:rPr>
+        <w:t>Product needs a lot more details:</w:t>
+      </w:r>
+    </w:p>
+    <w:p>
+      <w:pPr>
+        <w:rPr>
+          <w:lang w:val="en-US"/>
+        </w:rPr>
+      </w:pPr>
+      <w:r>
+        <w:rPr>
+          <w:lang w:val="en-US"/>
+        </w:rPr>
+        <w:t xml:space="preserve">    summary:</w:t>
+      </w:r>
+    </w:p>
+    <w:p>
+      <w:pPr>
+        <w:rPr>
+          <w:lang w:val="en-US"/>
+        </w:rPr>
+      </w:pPr>
+      <w:r>
+        <w:rPr>
+          <w:lang w:val="en-US"/>
+        </w:rPr>
+        <w:t xml:space="preserve">      description: |</w:t>
+      </w:r>
+    </w:p>
+    <w:p>
+      <w:pPr>
+        <w:rPr>
+          <w:lang w:val="en-US"/>
+        </w:rPr>
+      </w:pPr>
+      <w:r>
+        <w:rPr>
+          <w:lang w:val="en-US"/>
+        </w:rPr>
+        <w:t xml:space="preserve">        A human-readable description of the product.</w:t>
+      </w:r>
+    </w:p>
+    <w:p>
+      <w:r>
+        <w:rPr>
+          <w:lang w:val="en-US"/>
+        </w:rPr>
+        <w:t xml:space="preserve">    </w:t>
+      </w:r>
+      <w:r>
+        <w:t>type:</w:t>
+      </w:r>
+    </w:p>
+    <w:p>
+      <w:r>
+        <w:t xml:space="preserve">  x-</w:t>
+      </w:r>
+      <w:proofErr w:type="spellStart"/>
+      <w:r>
+        <w:t>extensible</w:t>
+      </w:r>
+      <w:proofErr w:type="spellEnd"/>
+      <w:r>
+        <w:t>-</w:t>
+      </w:r>
+      <w:proofErr w:type="spellStart"/>
+      <w:r>
+        <w:t>enum</w:t>
+      </w:r>
+      <w:proofErr w:type="spellEnd"/>
+      <w:r>
+        <w:t>:</w:t>
+      </w:r>
+    </w:p>
+    <w:p>
+      <w:r>
+        <w:t xml:space="preserve">    - ADMISSION_PASS</w:t>
+      </w:r>
+    </w:p>
+    <w:p>
+      <w:r>
+        <w:t xml:space="preserve">    - ADMISSION_MULTI_RIDE</w:t>
+      </w:r>
+    </w:p>
+    <w:p>
+      <w:r>
+        <w:t xml:space="preserve">    - ADMISSION_POINT2POINT</w:t>
+      </w:r>
+    </w:p>
+    <w:p>
+      <w:r>
+        <w:t xml:space="preserve">    - UPGRADE_PASS</w:t>
+      </w:r>
+    </w:p>
+    <w:p>
+      <w:pPr>
+        <w:rPr>
+          <w:lang w:val="en-US"/>
+        </w:rPr>
+      </w:pPr>
+      <w:r>
+        <w:t xml:space="preserve">    </w:t>
+      </w:r>
+      <w:r>
+        <w:rPr>
+          <w:lang w:val="en-US"/>
+        </w:rPr>
+        <w:t>- UPGRADE_MULTI_RIDE</w:t>
+      </w:r>
+    </w:p>
+    <w:p>
+      <w:pPr>
+        <w:rPr>
+          <w:lang w:val="en-US"/>
+        </w:rPr>
+      </w:pPr>
+      <w:r>
+        <w:rPr>
+          <w:lang w:val="en-US"/>
+        </w:rPr>
+        <w:lastRenderedPageBreak/>
+        <w:t xml:space="preserve">    - UPGRADE_POINT2POINT</w:t>
+      </w:r>
+    </w:p>
+    <w:p>
+      <w:pPr>
+        <w:rPr>
+          <w:lang w:val="en-US"/>
+        </w:rPr>
+      </w:pPr>
+      <w:r>
+        <w:rPr>
+          <w:lang w:val="en-US"/>
+        </w:rPr>
+        <w:t xml:space="preserve">    - RESERVATION</w:t>
+      </w:r>
+    </w:p>
+    <w:p>
+      <w:pPr>
+        <w:rPr>
+          <w:lang w:val="en-US"/>
+        </w:rPr>
+      </w:pPr>
+      <w:r>
+        <w:rPr>
+          <w:lang w:val="en-US"/>
+        </w:rPr>
+        <w:t xml:space="preserve">    - ANCILLARY_SERVICE</w:t>
+      </w:r>
+    </w:p>
+    <w:p>
+      <w:pPr>
+        <w:rPr>
+          <w:lang w:val="en-US"/>
+        </w:rPr>
+      </w:pPr>
+      <w:r>
+        <w:rPr>
+          <w:lang w:val="en-US"/>
+        </w:rPr>
+        <w:t xml:space="preserve">    - ANCILLARY_ITEM</w:t>
+      </w:r>
+    </w:p>
+    <w:p>
+      <w:pPr>
+        <w:rPr>
+          <w:lang w:val="en-US"/>
+        </w:rPr>
+      </w:pPr>
+      <w:r>
+        <w:rPr>
+          <w:lang w:val="en-US"/>
+        </w:rPr>
+        <w:t xml:space="preserve">    - REDUCTION_CARD</w:t>
+      </w:r>
+    </w:p>
+    <w:p>
+      <w:pPr>
+        <w:rPr>
+          <w:lang w:val="en-US"/>
+        </w:rPr>
+      </w:pPr>
+      <w:r>
+        <w:rPr>
+          <w:lang w:val="en-US"/>
+        </w:rPr>
+        <w:t xml:space="preserve">    code:        The product code expressed in the provider system (could be a</w:t>
+      </w:r>
+    </w:p>
+    <w:p>
+      <w:pPr>
+        <w:rPr>
+          <w:lang w:val="en-US"/>
+        </w:rPr>
+      </w:pPr>
+      <w:r>
+        <w:rPr>
+          <w:lang w:val="en-US"/>
+        </w:rPr>
+        <w:t xml:space="preserve">        mapping from an even lower-level provider).</w:t>
+      </w:r>
+    </w:p>
+    <w:p>
+      <w:pPr>
+        <w:rPr>
+          <w:lang w:val="en-US"/>
+        </w:rPr>
+      </w:pPr>
+      <w:r>
+        <w:rPr>
+          <w:lang w:val="en-US"/>
+        </w:rPr>
+        <w:t xml:space="preserve">      examples:</w:t>
+      </w:r>
+    </w:p>
+    <w:p>
+      <w:pPr>
+        <w:rPr>
+          <w:lang w:val="en-US"/>
+        </w:rPr>
+      </w:pPr>
+      <w:r>
+        <w:rPr>
+          <w:lang w:val="en-US"/>
+        </w:rPr>
+        <w:t xml:space="preserve">        - PT00AD</w:t>
+      </w:r>
+    </w:p>
+    <w:p>
+      <w:pPr>
+        <w:rPr>
+          <w:lang w:val="en-US"/>
+        </w:rPr>
+      </w:pPr>
+      <w:r>
+        <w:rPr>
+          <w:lang w:val="en-US"/>
+        </w:rPr>
+        <w:t xml:space="preserve">    description:          Textual description of the product.</w:t>
+      </w:r>
+    </w:p>
+    <w:p>
+      <w:pPr>
+        <w:rPr>
+          <w:lang w:val="en-US"/>
+        </w:rPr>
+      </w:pPr>
+      <w:r>
+        <w:rPr>
+          <w:lang w:val="en-US"/>
+        </w:rPr>
+        <w:t xml:space="preserve">    owner:          $ref: '#/components/schemas/</w:t>
+      </w:r>
+      <w:proofErr w:type="spellStart"/>
+      <w:r>
+        <w:rPr>
+          <w:lang w:val="en-US"/>
+        </w:rPr>
+        <w:t>CompanyRef</w:t>
+      </w:r>
+      <w:proofErr w:type="spellEnd"/>
+      <w:r>
+        <w:rPr>
+          <w:lang w:val="en-US"/>
+        </w:rPr>
+        <w:t>'</w:t>
+      </w:r>
+    </w:p>
+    <w:p>
+      <w:pPr>
+        <w:rPr>
+          <w:lang w:val="en-US"/>
+        </w:rPr>
+      </w:pPr>
+      <w:r>
+        <w:rPr>
+          <w:lang w:val="en-US"/>
+        </w:rPr>
+        <w:t xml:space="preserve">    conditions:</w:t>
+      </w:r>
+    </w:p>
+    <w:p>
+      <w:pPr>
+        <w:rPr>
+          <w:lang w:val="en-US"/>
+        </w:rPr>
+      </w:pPr>
+      <w:r>
+        <w:rPr>
+          <w:lang w:val="en-US"/>
+        </w:rPr>
+        <w:t xml:space="preserve">      description: |</w:t>
+      </w:r>
+    </w:p>
+    <w:p>
+      <w:pPr>
+        <w:rPr>
+          <w:lang w:val="en-US"/>
+        </w:rPr>
+      </w:pPr>
+      <w:r>
+        <w:rPr>
+          <w:lang w:val="en-US"/>
+        </w:rPr>
+        <w:t xml:space="preserve">        description of the sales or after-sales conditions.</w:t>
+      </w:r>
+    </w:p>
+    <w:p>
+      <w:pPr>
+        <w:rPr>
+          <w:lang w:val="en-US"/>
+        </w:rPr>
+      </w:pPr>
+      <w:r>
+        <w:rPr>
+          <w:lang w:val="en-US"/>
+        </w:rPr>
+        <w:t xml:space="preserve">      type: array</w:t>
+      </w:r>
+    </w:p>
+    <w:p>
+      <w:pPr>
+        <w:rPr>
+          <w:lang w:val="en-US"/>
+        </w:rPr>
+      </w:pPr>
+      <w:r>
+        <w:rPr>
+          <w:lang w:val="en-US"/>
+        </w:rPr>
+        <w:t xml:space="preserve">      items:</w:t>
+      </w:r>
+    </w:p>
+    <w:p>
+      <w:pPr>
+        <w:rPr>
+          <w:lang w:val="en-US"/>
+        </w:rPr>
+      </w:pPr>
+      <w:r>
+        <w:rPr>
+          <w:lang w:val="en-US"/>
+        </w:rPr>
+        <w:t xml:space="preserve">        $ref: '#/components/schemas/Condition'</w:t>
+      </w:r>
+    </w:p>
+    <w:p>
+      <w:pPr>
+        <w:rPr>
+          <w:lang w:val="en-US"/>
+        </w:rPr>
+      </w:pPr>
+      <w:r>
+        <w:rPr>
+          <w:lang w:val="en-US"/>
+        </w:rPr>
+        <w:t xml:space="preserve">    flexibility:</w:t>
+      </w:r>
+    </w:p>
+    <w:p>
+      <w:pPr>
+        <w:rPr>
+          <w:lang w:val="en-US"/>
+        </w:rPr>
+      </w:pPr>
+      <w:r>
+        <w:rPr>
+          <w:lang w:val="en-US"/>
+        </w:rPr>
+        <w:t xml:space="preserve">        x-extensible-</w:t>
+      </w:r>
+      <w:proofErr w:type="spellStart"/>
+      <w:r>
+        <w:rPr>
+          <w:lang w:val="en-US"/>
+        </w:rPr>
+        <w:t>enum</w:t>
+      </w:r>
+      <w:proofErr w:type="spellEnd"/>
+      <w:r>
+        <w:rPr>
+          <w:lang w:val="en-US"/>
+        </w:rPr>
+        <w:t>:</w:t>
+      </w:r>
+    </w:p>
+    <w:p>
+      <w:pPr>
+        <w:rPr>
+          <w:lang w:val="en-US"/>
+        </w:rPr>
+      </w:pPr>
+      <w:r>
+        <w:rPr>
+          <w:lang w:val="en-US"/>
+        </w:rPr>
+        <w:t xml:space="preserve">         - FULL_FLEXIBLE</w:t>
+      </w:r>
+    </w:p>
+    <w:p>
+      <w:pPr>
+        <w:rPr>
+          <w:lang w:val="fr-FR"/>
+        </w:rPr>
+      </w:pPr>
+      <w:r>
+        <w:rPr>
+          <w:lang w:val="en-US"/>
+        </w:rPr>
+        <w:t xml:space="preserve">         </w:t>
+      </w:r>
+      <w:r>
+        <w:rPr>
+          <w:lang w:val="fr-FR"/>
+        </w:rPr>
+        <w:t>- SEMI_FLEXIBLE</w:t>
+      </w:r>
+    </w:p>
+    <w:p>
+      <w:pPr>
+        <w:rPr>
+          <w:lang w:val="fr-FR"/>
+        </w:rPr>
+      </w:pPr>
+      <w:r>
+        <w:rPr>
+          <w:lang w:val="fr-FR"/>
+        </w:rPr>
+        <w:t xml:space="preserve">         - NON_FLEXIBLE</w:t>
+      </w:r>
+    </w:p>
+    <w:p>
+      <w:pPr>
+        <w:rPr>
+          <w:lang w:val="fr-FR"/>
+        </w:rPr>
+      </w:pPr>
+      <w:r>
+        <w:rPr>
+          <w:lang w:val="fr-FR"/>
+        </w:rPr>
+        <w:t xml:space="preserve">    </w:t>
+      </w:r>
+      <w:proofErr w:type="spellStart"/>
+      <w:r>
+        <w:rPr>
+          <w:lang w:val="fr-FR"/>
+        </w:rPr>
+        <w:t>serviceClass</w:t>
+      </w:r>
+      <w:proofErr w:type="spellEnd"/>
+      <w:r>
+        <w:rPr>
+          <w:lang w:val="fr-FR"/>
+        </w:rPr>
+        <w:t>:</w:t>
+      </w:r>
+    </w:p>
+    <w:p>
+      <w:pPr>
+        <w:rPr>
+          <w:lang w:val="en-US"/>
+        </w:rPr>
+      </w:pPr>
+      <w:r>
+        <w:rPr>
+          <w:lang w:val="fr-FR"/>
+        </w:rPr>
+        <w:t xml:space="preserve">      </w:t>
+      </w:r>
+      <w:r>
+        <w:rPr>
+          <w:lang w:val="en-US"/>
+        </w:rPr>
+        <w:t>$ref: '#/components/schemas/</w:t>
+      </w:r>
+      <w:proofErr w:type="spellStart"/>
+      <w:r>
+        <w:rPr>
+          <w:lang w:val="en-US"/>
+        </w:rPr>
+        <w:t>ServiceClass</w:t>
+      </w:r>
+      <w:proofErr w:type="spellEnd"/>
+      <w:r>
+        <w:rPr>
+          <w:lang w:val="en-US"/>
+        </w:rPr>
+        <w:t>'</w:t>
+      </w:r>
+    </w:p>
+    <w:p>
+      <w:pPr>
+        <w:rPr>
+          <w:lang w:val="en-US"/>
+        </w:rPr>
+      </w:pPr>
+      <w:r>
+        <w:rPr>
+          <w:lang w:val="en-US"/>
+        </w:rPr>
+        <w:t xml:space="preserve">    </w:t>
+      </w:r>
+      <w:proofErr w:type="spellStart"/>
+      <w:r>
+        <w:rPr>
+          <w:lang w:val="en-US"/>
+        </w:rPr>
+        <w:t>travelClass</w:t>
+      </w:r>
+      <w:proofErr w:type="spellEnd"/>
+      <w:r>
+        <w:rPr>
+          <w:lang w:val="en-US"/>
+        </w:rPr>
+        <w:t>:</w:t>
+      </w:r>
+    </w:p>
+    <w:p>
+      <w:pPr>
+        <w:rPr>
+          <w:lang w:val="en-US"/>
+        </w:rPr>
+      </w:pPr>
+      <w:r>
+        <w:rPr>
+          <w:lang w:val="en-US"/>
+        </w:rPr>
+        <w:t xml:space="preserve">      $ref: '#/components/schemas/</w:t>
+      </w:r>
+      <w:proofErr w:type="spellStart"/>
+      <w:r>
+        <w:rPr>
+          <w:lang w:val="en-US"/>
+        </w:rPr>
+        <w:t>TravelClass</w:t>
+      </w:r>
+      <w:proofErr w:type="spellEnd"/>
+      <w:r>
+        <w:rPr>
+          <w:lang w:val="en-US"/>
+        </w:rPr>
+        <w:t>'</w:t>
+      </w:r>
+    </w:p>
+    <w:p>
+      <w:pPr>
+        <w:rPr>
+          <w:lang w:val="en-US"/>
+        </w:rPr>
+      </w:pPr>
+      <w:r>
+        <w:rPr>
+          <w:lang w:val="en-US"/>
+        </w:rPr>
+        <w:t xml:space="preserve">    </w:t>
+      </w:r>
+      <w:proofErr w:type="spellStart"/>
+      <w:r>
+        <w:rPr>
+          <w:lang w:val="en-US"/>
+        </w:rPr>
+        <w:t>fulfillmentOptions</w:t>
+      </w:r>
+      <w:proofErr w:type="spellEnd"/>
+      <w:r>
+        <w:rPr>
+          <w:lang w:val="en-US"/>
+        </w:rPr>
+        <w:t>:</w:t>
+      </w:r>
+    </w:p>
+    <w:p>
+      <w:pPr>
+        <w:rPr>
+          <w:lang w:val="en-US"/>
+        </w:rPr>
+      </w:pPr>
+      <w:r>
+        <w:rPr>
+          <w:lang w:val="en-US"/>
+        </w:rPr>
+        <w:t xml:space="preserve">      type: array</w:t>
+      </w:r>
+    </w:p>
+    <w:p>
+      <w:pPr>
+        <w:rPr>
+          <w:lang w:val="en-US"/>
+        </w:rPr>
+      </w:pPr>
+      <w:r>
+        <w:rPr>
+          <w:lang w:val="en-US"/>
+        </w:rPr>
+        <w:lastRenderedPageBreak/>
+        <w:t xml:space="preserve">      items:</w:t>
+      </w:r>
+    </w:p>
+    <w:p>
+      <w:pPr>
+        <w:rPr>
+          <w:lang w:val="en-US"/>
+        </w:rPr>
+      </w:pPr>
+      <w:r>
+        <w:rPr>
+          <w:lang w:val="en-US"/>
+        </w:rPr>
+        <w:t xml:space="preserve">        $ref: '#/components/schemas/</w:t>
+      </w:r>
+      <w:proofErr w:type="spellStart"/>
+      <w:r>
+        <w:rPr>
+          <w:lang w:val="en-US"/>
+        </w:rPr>
+        <w:t>FulfillmentOption</w:t>
+      </w:r>
+      <w:proofErr w:type="spellEnd"/>
+      <w:r>
+        <w:rPr>
+          <w:lang w:val="en-US"/>
+        </w:rPr>
+        <w:t>'</w:t>
+      </w:r>
+    </w:p>
+    <w:p>
+      <w:pPr>
+        <w:rPr>
+          <w:lang w:val="en-US"/>
+        </w:rPr>
+      </w:pPr>
+      <w:r>
+        <w:rPr>
+          <w:lang w:val="en-US"/>
+        </w:rPr>
+        <w:t xml:space="preserve">    </w:t>
+      </w:r>
+      <w:proofErr w:type="spellStart"/>
+      <w:r>
+        <w:rPr>
+          <w:lang w:val="en-US"/>
+        </w:rPr>
+        <w:t>isTrainBound</w:t>
+      </w:r>
+      <w:proofErr w:type="spellEnd"/>
+      <w:r>
+        <w:rPr>
+          <w:lang w:val="en-US"/>
+        </w:rPr>
+        <w:t xml:space="preserve">:       - </w:t>
+      </w:r>
+      <w:proofErr w:type="spellStart"/>
+      <w:r>
+        <w:rPr>
+          <w:lang w:val="en-US"/>
+        </w:rPr>
+        <w:t>boolean</w:t>
+      </w:r>
+      <w:proofErr w:type="spellEnd"/>
+    </w:p>
+    <w:p>
+      <w:pPr>
+        <w:rPr>
+          <w:lang w:val="en-US"/>
+        </w:rPr>
+      </w:pPr>
+      <w:r>
+        <w:rPr>
+          <w:lang w:val="en-US"/>
+        </w:rPr>
+        <w:t xml:space="preserve">    </w:t>
+      </w:r>
+      <w:proofErr w:type="spellStart"/>
+      <w:r>
+        <w:rPr>
+          <w:lang w:val="en-US"/>
+        </w:rPr>
+        <w:t>isReturnProduct</w:t>
+      </w:r>
+      <w:proofErr w:type="spellEnd"/>
+      <w:r>
+        <w:rPr>
+          <w:lang w:val="en-US"/>
+        </w:rPr>
+        <w:t xml:space="preserve">:  - </w:t>
+      </w:r>
+      <w:proofErr w:type="spellStart"/>
+      <w:r>
+        <w:rPr>
+          <w:lang w:val="en-US"/>
+        </w:rPr>
+        <w:t>boolean</w:t>
+      </w:r>
+      <w:proofErr w:type="spellEnd"/>
+    </w:p>
+    <w:p>
+      <w:pPr>
+        <w:rPr>
+          <w:lang w:val="en-US"/>
+        </w:rPr>
+      </w:pPr>
+      <w:r>
+        <w:rPr>
+          <w:lang w:val="en-US"/>
+        </w:rPr>
+        <w:t xml:space="preserve">    </w:t>
+      </w:r>
+      <w:proofErr w:type="spellStart"/>
+      <w:r>
+        <w:rPr>
+          <w:lang w:val="en-US"/>
+        </w:rPr>
+        <w:t>serviceConstraintText</w:t>
+      </w:r>
+      <w:proofErr w:type="spellEnd"/>
+      <w:r>
+        <w:rPr>
+          <w:lang w:val="en-US"/>
+        </w:rPr>
+        <w:t>:  condition on the services to be used</w:t>
+      </w:r>
+    </w:p>
+    <w:p>
+      <w:pPr>
+        <w:rPr>
+          <w:lang w:val="en-US"/>
+        </w:rPr>
+      </w:pPr>
+      <w:r>
+        <w:rPr>
+          <w:lang w:val="en-US"/>
+        </w:rPr>
+        <w:t xml:space="preserve">    </w:t>
+      </w:r>
+      <w:proofErr w:type="spellStart"/>
+      <w:r>
+        <w:rPr>
+          <w:lang w:val="en-US"/>
+        </w:rPr>
+        <w:t>carrierConstraintText</w:t>
+      </w:r>
+      <w:proofErr w:type="spellEnd"/>
+      <w:r>
+        <w:rPr>
+          <w:lang w:val="en-US"/>
+        </w:rPr>
+        <w:t>:   condition on the carriers to be used</w:t>
+      </w:r>
+    </w:p>
+    <w:p>
+      <w:pPr>
+        <w:rPr>
+          <w:lang w:val="en-US"/>
+        </w:rPr>
+      </w:pPr>
+      <w:r>
+        <w:rPr>
+          <w:lang w:val="en-US"/>
+        </w:rPr>
+        <w:t xml:space="preserve">    </w:t>
+      </w:r>
+      <w:proofErr w:type="spellStart"/>
+      <w:r>
+        <w:rPr>
+          <w:lang w:val="en-US"/>
+        </w:rPr>
+        <w:t>combinationTags</w:t>
+      </w:r>
+      <w:proofErr w:type="spellEnd"/>
+      <w:r>
+        <w:rPr>
+          <w:lang w:val="en-US"/>
+        </w:rPr>
+        <w:t>:         governing the combination with other providers products</w:t>
+      </w:r>
+    </w:p>
+    <w:p>
+      <w:r>
+        <w:rPr>
+          <w:lang w:val="en-US"/>
+        </w:rPr>
+        <w:t xml:space="preserve">    </w:t>
+      </w:r>
+      <w:r>
+        <w:t>_links:</w:t>
+      </w:r>
+    </w:p>
+    <w:p>
+      <w:r>
+        <w:t xml:space="preserve">      $ref: '#/</w:t>
+      </w:r>
+      <w:proofErr w:type="spellStart"/>
+      <w:r>
+        <w:t>components</w:t>
+      </w:r>
+      <w:proofErr w:type="spellEnd"/>
+      <w:r>
+        <w:t>/</w:t>
+      </w:r>
+      <w:proofErr w:type="spellStart"/>
+      <w:r>
+        <w:t>schemas</w:t>
+      </w:r>
+      <w:proofErr w:type="spellEnd"/>
+      <w:r>
+        <w:t>/Links'</w:t>
+      </w:r>
+    </w:p>
+    <w:p>
+      <w:pPr>
+        <w:rPr>
+          <w:lang w:val="en-US"/>
+        </w:rPr>
+      </w:pPr>
+    </w:p>
+    <w:p>
+      <w:pPr>
+        <w:rPr>
+          <w:lang w:val="en-US"/>
+        </w:rPr>
+      </w:pPr>
     </w:p>
     <w:p>
       <w:pPr>

</xml_diff>

<commit_message>
Search offers - the 'Delivery' part - 20260702 (#68)
* Add search offers deliverables: data model YAML files and QEA

* Add search offers delivery schemas: Package, OfferElements, Fulfillment and supporting types

* Refine search offers delivery schemas: descriptions, required fields and property updates

* updated after sessions

* updated the complete model, addressed most of the questions.

* Fix the summary detail

* And a fix on locked offer (discrepancy)

* Ready to release (all remarks taken into account)
</commit_message>
<xml_diff>
--- a/deliverables/1 search offers/Search for offers - to do list.docx
+++ b/deliverables/1 search offers/Search for offers - to do list.docx
@@ -103,13 +103,7 @@
         <w:rPr>
           <w:lang w:val="en-US"/>
         </w:rPr>
-        <w:t>E</w:t>
-      </w:r>
-      <w:r>
-        <w:rPr>
-          <w:lang w:val="en-US"/>
-        </w:rPr>
-        <w:t>dwinvandenbelt</w:t>
+        <w:t>Edwinvandenbelt</w:t>
       </w:r>
       <w:proofErr w:type="spellEnd"/>
       <w:r>
@@ -163,31 +157,16 @@
         <w:rPr>
           <w:lang w:val="en-US"/>
         </w:rPr>
-        <w:t xml:space="preserve"> want to extend </w:t>
-      </w:r>
-      <w:proofErr w:type="gramStart"/>
-      <w:r>
-        <w:rPr>
-          <w:lang w:val="en-US"/>
-        </w:rPr>
-        <w:t>it</w:t>
-      </w:r>
-      <w:proofErr w:type="gramEnd"/>
-      <w:r>
-        <w:rPr>
-          <w:lang w:val="en-US"/>
-        </w:rPr>
-        <w:t>, they can, after notifying the OTI governance body.</w:t>
-      </w:r>
-    </w:p>
-    <w:p>
-      <w:pPr>
-        <w:rPr>
-          <w:lang w:val="en-US"/>
-        </w:rPr>
-      </w:pPr>
-      <w:proofErr w:type="spellStart"/>
-      <w:proofErr w:type="gramStart"/>
+        <w:t xml:space="preserve"> want to extend it, they can, after notifying the OTI governance body.</w:t>
+      </w:r>
+    </w:p>
+    <w:p>
+      <w:pPr>
+        <w:rPr>
+          <w:lang w:val="en-US"/>
+        </w:rPr>
+      </w:pPr>
+      <w:proofErr w:type="spellStart"/>
       <w:r>
         <w:rPr>
           <w:lang w:val="en-US"/>
@@ -199,14 +178,7 @@
         <w:rPr>
           <w:lang w:val="en-US"/>
         </w:rPr>
-        <w:t xml:space="preserve"> :</w:t>
-      </w:r>
-      <w:proofErr w:type="gramEnd"/>
-      <w:r>
-        <w:rPr>
-          <w:lang w:val="en-US"/>
-        </w:rPr>
-        <w:t xml:space="preserve"> </w:t>
+        <w:t xml:space="preserve"> : </w:t>
       </w:r>
       <w:r>
         <w:rPr>
@@ -226,21 +198,7 @@
         <w:rPr>
           <w:lang w:val="en-US"/>
         </w:rPr>
-        <w:t xml:space="preserve"> by size of the animal as it often </w:t>
-      </w:r>
-      <w:proofErr w:type="gramStart"/>
-      <w:r>
-        <w:rPr>
-          <w:lang w:val="en-US"/>
-        </w:rPr>
-        <w:t>as</w:t>
-      </w:r>
-      <w:proofErr w:type="gramEnd"/>
-      <w:r>
-        <w:rPr>
-          <w:lang w:val="en-US"/>
-        </w:rPr>
-        <w:t xml:space="preserve"> more impact of the footprint of a travelling entity</w:t>
+        <w:t xml:space="preserve"> by size of the animal as it often as more impact of the footprint of a travelling entity</w:t>
       </w:r>
     </w:p>
     <w:p>
@@ -279,13 +237,7 @@
         <w:rPr>
           <w:lang w:val="en-US"/>
         </w:rPr>
-        <w:t>E</w:t>
-      </w:r>
-      <w:r>
-        <w:rPr>
-          <w:lang w:val="en-US"/>
-        </w:rPr>
-        <w:t>inarbjorkevoll</w:t>
+        <w:t>Einarbjorkevoll</w:t>
       </w:r>
       <w:proofErr w:type="spellEnd"/>
       <w:r>
@@ -361,112 +313,34 @@
         <w:rPr>
           <w:lang w:val="en-US"/>
         </w:rPr>
-        <w:t xml:space="preserve">I don't see where to give information on NFC smartcard held by a passenger. It is not a </w:t>
-      </w:r>
-      <w:proofErr w:type="gramStart"/>
-      <w:r>
-        <w:rPr>
-          <w:lang w:val="en-US"/>
-        </w:rPr>
-        <w:t>mean</w:t>
-      </w:r>
-      <w:proofErr w:type="gramEnd"/>
-      <w:r>
-        <w:rPr>
-          <w:lang w:val="en-US"/>
-        </w:rPr>
-        <w:t xml:space="preserve"> </w:t>
-      </w:r>
-      <w:proofErr w:type="gramStart"/>
-      <w:r>
-        <w:rPr>
-          <w:lang w:val="en-US"/>
-        </w:rPr>
-        <w:t>to get reduced</w:t>
-      </w:r>
-      <w:proofErr w:type="gramEnd"/>
-      <w:r>
-        <w:rPr>
-          <w:lang w:val="en-US"/>
-        </w:rPr>
-        <w:t xml:space="preserve"> or additional offer. thus:</w:t>
-      </w:r>
-    </w:p>
-    <w:p>
-      <w:pPr>
-        <w:rPr>
-          <w:lang w:val="en-US"/>
-        </w:rPr>
-      </w:pPr>
-      <w:r>
-        <w:rPr>
-          <w:lang w:val="en-US"/>
-        </w:rPr>
-        <w:t xml:space="preserve">either generalize this area with any object held by a traveller that could </w:t>
-      </w:r>
-      <w:proofErr w:type="gramStart"/>
-      <w:r>
-        <w:rPr>
-          <w:lang w:val="en-US"/>
-        </w:rPr>
-        <w:t>impact</w:t>
-      </w:r>
-      <w:proofErr w:type="gramEnd"/>
-      <w:r>
-        <w:rPr>
-          <w:lang w:val="en-US"/>
-        </w:rPr>
-        <w:t xml:space="preserve"> the distribution (not only a </w:t>
-      </w:r>
-      <w:proofErr w:type="gramStart"/>
-      <w:r>
-        <w:rPr>
-          <w:lang w:val="en-US"/>
-        </w:rPr>
-        <w:t>mean</w:t>
-      </w:r>
-      <w:proofErr w:type="gramEnd"/>
-      <w:r>
-        <w:rPr>
-          <w:lang w:val="en-US"/>
-        </w:rPr>
-        <w:t xml:space="preserve"> to get a reduced or additional offer).</w:t>
-      </w:r>
-    </w:p>
-    <w:p>
-      <w:pPr>
-        <w:rPr>
-          <w:lang w:val="en-US"/>
-        </w:rPr>
-      </w:pPr>
-      <w:r>
-        <w:rPr>
-          <w:lang w:val="en-US"/>
-        </w:rPr>
-        <w:t xml:space="preserve">or create a dedicated object around fulfilment device held by the traveller (NFC card, ID of </w:t>
-      </w:r>
-      <w:proofErr w:type="gramStart"/>
-      <w:r>
-        <w:rPr>
-          <w:lang w:val="en-US"/>
-        </w:rPr>
-        <w:t>a</w:t>
-      </w:r>
-      <w:proofErr w:type="gramEnd"/>
-      <w:r>
-        <w:rPr>
-          <w:lang w:val="en-US"/>
-        </w:rPr>
-        <w:t xml:space="preserve"> enrolled smartphone</w:t>
-      </w:r>
-      <w:proofErr w:type="gramStart"/>
-      <w:r>
-        <w:rPr>
-          <w:lang w:val="en-US"/>
-        </w:rPr>
-        <w:t>)</w:t>
-      </w:r>
-      <w:proofErr w:type="gramEnd"/>
+        <w:t>I don't see where to give information on NFC smartcard held by a passenger. It is not a mean to get reduced or additional offer. thus:</w:t>
+      </w:r>
+    </w:p>
+    <w:p>
+      <w:pPr>
+        <w:rPr>
+          <w:lang w:val="en-US"/>
+        </w:rPr>
+      </w:pPr>
+      <w:r>
+        <w:rPr>
+          <w:lang w:val="en-US"/>
+        </w:rPr>
+        <w:t>either generalize this area with any object held by a traveller that could impact the distribution (not only a mean to get a reduced or additional offer).</w:t>
+      </w:r>
+    </w:p>
+    <w:p>
+      <w:pPr>
+        <w:rPr>
+          <w:lang w:val="en-US"/>
+        </w:rPr>
+      </w:pPr>
+      <w:r>
+        <w:rPr>
+          <w:lang w:val="en-US"/>
+        </w:rPr>
+        <w:t>or create a dedicated object around fulfilment device held by the traveller (NFC card, ID of a enrolled smartphone)</w:t>
+      </w:r>
     </w:p>
     <w:p>
       <w:pPr>
@@ -490,21 +364,7 @@
         <w:rPr>
           <w:lang w:val="en-US"/>
         </w:rPr>
-        <w:t xml:space="preserve">To support card based and </w:t>
-      </w:r>
-      <w:proofErr w:type="gramStart"/>
-      <w:r>
-        <w:rPr>
-          <w:lang w:val="en-US"/>
-        </w:rPr>
-        <w:t>account based</w:t>
-      </w:r>
-      <w:proofErr w:type="gramEnd"/>
-      <w:r>
-        <w:rPr>
-          <w:lang w:val="en-US"/>
-        </w:rPr>
-        <w:t xml:space="preserve"> ticketing the card details are necessary from the beginning, optionally also including the card content.</w:t>
+        <w:t>To support card based and account based ticketing the card details are necessary from the beginning, optionally also including the card content.</w:t>
       </w:r>
     </w:p>
     <w:p>
@@ -593,21 +453,7 @@
         <w:rPr>
           <w:lang w:val="en-US"/>
         </w:rPr>
-        <w:t xml:space="preserve">Number and issuer are needed to identify a travel </w:t>
-      </w:r>
-      <w:proofErr w:type="gramStart"/>
-      <w:r>
-        <w:rPr>
-          <w:lang w:val="en-US"/>
-        </w:rPr>
-        <w:t>account,</w:t>
-      </w:r>
-      <w:proofErr w:type="gramEnd"/>
-      <w:r>
-        <w:rPr>
-          <w:lang w:val="en-US"/>
-        </w:rPr>
-        <w:t xml:space="preserve"> the code identifies a reduction card.</w:t>
+        <w:t>Number and issuer are needed to identify a travel account, the code identifies a reduction card.</w:t>
       </w:r>
     </w:p>
     <w:p>
@@ -802,21 +648,7 @@
         <w:rPr>
           <w:lang w:val="en-US"/>
         </w:rPr>
-        <w:t>$ref</w:t>
-      </w:r>
-      <w:proofErr w:type="gramStart"/>
-      <w:r>
-        <w:rPr>
-          <w:lang w:val="en-US"/>
-        </w:rPr>
-        <w:t>: '#/</w:t>
-      </w:r>
-      <w:proofErr w:type="gramEnd"/>
-      <w:r>
-        <w:rPr>
-          <w:lang w:val="en-US"/>
-        </w:rPr>
-        <w:t>components/schemas/</w:t>
+        <w:t>$ref: '#/components/schemas/</w:t>
       </w:r>
       <w:proofErr w:type="spellStart"/>
       <w:r>
@@ -856,21 +688,7 @@
         <w:rPr>
           <w:lang w:val="en-US"/>
         </w:rPr>
-        <w:t>$ref</w:t>
-      </w:r>
-      <w:proofErr w:type="gramStart"/>
-      <w:r>
-        <w:rPr>
-          <w:lang w:val="en-US"/>
-        </w:rPr>
-        <w:t>: '#/</w:t>
-      </w:r>
-      <w:proofErr w:type="gramEnd"/>
-      <w:r>
-        <w:rPr>
-          <w:lang w:val="en-US"/>
-        </w:rPr>
-        <w:t>components/schemas/</w:t>
+        <w:t>$ref: '#/components/schemas/</w:t>
       </w:r>
       <w:proofErr w:type="spellStart"/>
       <w:r>
@@ -1099,21 +917,7 @@
         <w:rPr>
           <w:lang w:val="en-US"/>
         </w:rPr>
-        <w:t xml:space="preserve">The travel account number </w:t>
-      </w:r>
-      <w:proofErr w:type="gramStart"/>
-      <w:r>
-        <w:rPr>
-          <w:lang w:val="en-US"/>
-        </w:rPr>
-        <w:t>need</w:t>
-      </w:r>
-      <w:proofErr w:type="gramEnd"/>
-      <w:r>
-        <w:rPr>
-          <w:lang w:val="en-US"/>
-        </w:rPr>
-        <w:t xml:space="preserve"> to be split into a personal account id and the account agreement id to cover separate account ids like using a credit card hash as account id.</w:t>
+        <w:t>The travel account number need to be split into a personal account id and the account agreement id to cover separate account ids like using a credit card hash as account id.</w:t>
       </w:r>
     </w:p>
     <w:p>
@@ -1221,13 +1025,7 @@
         <w:rPr>
           <w:lang w:val="en-US"/>
         </w:rPr>
-        <w:t>E</w:t>
-      </w:r>
-      <w:r>
-        <w:rPr>
-          <w:lang w:val="en-US"/>
-        </w:rPr>
-        <w:t>dwinvandenbelt</w:t>
+        <w:t>Edwinvandenbelt</w:t>
       </w:r>
       <w:proofErr w:type="spellEnd"/>
       <w:r>
@@ -1276,19 +1074,11 @@
           <w:lang w:val="en-US"/>
         </w:rPr>
       </w:pPr>
-      <w:proofErr w:type="gramStart"/>
-      <w:r>
-        <w:rPr>
-          <w:lang w:val="en-US"/>
-        </w:rPr>
-        <w:t>{ "</w:t>
-      </w:r>
-      <w:proofErr w:type="gramEnd"/>
-      <w:r>
-        <w:rPr>
-          <w:lang w:val="en-US"/>
-        </w:rPr>
-        <w:t>issuer": "NS", "</w:t>
+      <w:r>
+        <w:rPr>
+          <w:lang w:val="en-US"/>
+        </w:rPr>
+        <w:t>{ "issuer": "NS", "</w:t>
       </w:r>
       <w:proofErr w:type="spellStart"/>
       <w:r>
@@ -1302,30 +1092,8 @@
         <w:rPr>
           <w:lang w:val="en-US"/>
         </w:rPr>
-        <w:t>": "voucher", "channel": "</w:t>
-      </w:r>
-      <w:proofErr w:type="gramStart"/>
-      <w:r>
-        <w:rPr>
-          <w:lang w:val="en-US"/>
-        </w:rPr>
-        <w:t>National museum</w:t>
-      </w:r>
-      <w:proofErr w:type="gramEnd"/>
-      <w:r>
-        <w:rPr>
-          <w:lang w:val="en-US"/>
-        </w:rPr>
-        <w:t>", "code": "SUMMER26</w:t>
-      </w:r>
-      <w:proofErr w:type="gramStart"/>
-      <w:r>
-        <w:rPr>
-          <w:lang w:val="en-US"/>
-        </w:rPr>
-        <w:t>" }</w:t>
-      </w:r>
-      <w:proofErr w:type="gramEnd"/>
+        <w:t>": "voucher", "channel": "National museum", "code": "SUMMER26" }</w:t>
+      </w:r>
     </w:p>
     <w:p>
       <w:pPr>
@@ -1382,13 +1150,7 @@
         <w:rPr>
           <w:lang w:val="en-US"/>
         </w:rPr>
-        <w:t>E</w:t>
-      </w:r>
-      <w:r>
-        <w:rPr>
-          <w:lang w:val="en-US"/>
-        </w:rPr>
-        <w:t>dwinvandenbelt</w:t>
+        <w:t>Edwinvandenbelt</w:t>
       </w:r>
       <w:proofErr w:type="spellEnd"/>
       <w:r>
@@ -1457,13 +1219,7 @@
         <w:rPr>
           <w:lang w:val="en-US"/>
         </w:rPr>
-        <w:t>E</w:t>
-      </w:r>
-      <w:r>
-        <w:rPr>
-          <w:lang w:val="en-US"/>
-        </w:rPr>
-        <w:t>dwinvandenbelt</w:t>
+        <w:t>Edwinvandenbelt</w:t>
       </w:r>
       <w:proofErr w:type="spellEnd"/>
       <w:r>
@@ -1663,7 +1419,6 @@
         <w:t xml:space="preserve">). But how to cope with the bike rental (you travel, but you come -in most cases- back to the departure location)? Is it a leg or is </w:t>
       </w:r>
       <w:proofErr w:type="spellStart"/>
-      <w:proofErr w:type="gramStart"/>
       <w:r>
         <w:rPr>
           <w:lang w:val="en-US"/>
@@ -1671,7 +1426,6 @@
         <w:t>is</w:t>
       </w:r>
       <w:proofErr w:type="spellEnd"/>
-      <w:proofErr w:type="gramEnd"/>
       <w:r>
         <w:rPr>
           <w:lang w:val="en-US"/>
@@ -2054,7 +1808,6 @@
         <w:t xml:space="preserve">regional traffic often uses line numbers instead of train numbers. To be multimodal it should be named </w:t>
       </w:r>
       <w:proofErr w:type="spellStart"/>
-      <w:proofErr w:type="gramStart"/>
       <w:r>
         <w:rPr>
           <w:lang w:val="en-US"/>
@@ -2062,7 +1815,6 @@
         <w:t>vehicleNumbers</w:t>
       </w:r>
       <w:proofErr w:type="spellEnd"/>
-      <w:proofErr w:type="gramEnd"/>
       <w:r>
         <w:rPr>
           <w:lang w:val="en-US"/>
@@ -2150,13 +1902,7 @@
         <w:rPr>
           <w:lang w:val="en-US"/>
         </w:rPr>
-        <w:t>E</w:t>
-      </w:r>
-      <w:r>
-        <w:rPr>
-          <w:lang w:val="en-US"/>
-        </w:rPr>
-        <w:t>dwinvandenbelt</w:t>
+        <w:t>Edwinvandenbelt</w:t>
       </w:r>
       <w:proofErr w:type="spellEnd"/>
       <w:r>
@@ -2372,6 +2118,7 @@
         <w:rPr>
           <w:i/>
           <w:iCs/>
+          <w:lang w:val="en-US"/>
         </w:rPr>
       </w:pPr>
       <w:r>
@@ -2386,6 +2133,7 @@
         <w:rPr>
           <w:i/>
           <w:iCs/>
+          <w:lang w:val="en-US"/>
         </w:rPr>
         <w:t>- ANY_CLASS</w:t>
       </w:r>
@@ -2459,19 +2207,11 @@
         </w:rPr>
         <w:t xml:space="preserve">Level of detail is </w:t>
       </w:r>
-      <w:proofErr w:type="gramStart"/>
-      <w:r>
-        <w:rPr>
-          <w:lang w:val="en-US"/>
-        </w:rPr>
-        <w:t>different,</w:t>
-      </w:r>
-      <w:proofErr w:type="gramEnd"/>
-      <w:r>
-        <w:rPr>
-          <w:lang w:val="en-US"/>
-        </w:rPr>
-        <w:t xml:space="preserve"> I personally think that the leg should be a subclass of the </w:t>
+      <w:r>
+        <w:rPr>
+          <w:lang w:val="en-US"/>
+        </w:rPr>
+        <w:t xml:space="preserve">different, I personally think that the leg should be a subclass of the </w:t>
       </w:r>
       <w:proofErr w:type="spellStart"/>
       <w:r>
@@ -2531,57 +2271,1559 @@
         <w:rPr>
           <w:lang w:val="en-US"/>
         </w:rPr>
+        <w:t xml:space="preserve">: The list of trip sections for the offers is missing in the </w:t>
+      </w:r>
+      <w:proofErr w:type="spellStart"/>
+      <w:r>
+        <w:rPr>
+          <w:lang w:val="en-US"/>
+        </w:rPr>
+        <w:t>SearchOfferFilters</w:t>
+      </w:r>
+      <w:proofErr w:type="spellEnd"/>
+    </w:p>
+    <w:p>
+      <w:pPr>
+        <w:rPr>
+          <w:lang w:val="en-US"/>
+        </w:rPr>
+      </w:pPr>
+      <w:proofErr w:type="spellStart"/>
+      <w:r>
+        <w:rPr>
+          <w:lang w:val="en-US"/>
+        </w:rPr>
+        <w:t>Edwinvandenbelt</w:t>
+      </w:r>
+      <w:proofErr w:type="spellEnd"/>
+      <w:r>
+        <w:rPr>
+          <w:lang w:val="en-US"/>
+        </w:rPr>
+        <w:t xml:space="preserve">: it is now directly in the </w:t>
+      </w:r>
+      <w:proofErr w:type="spellStart"/>
+      <w:r>
+        <w:rPr>
+          <w:lang w:val="en-US"/>
+        </w:rPr>
+        <w:t>searchofferrequest</w:t>
+      </w:r>
+      <w:proofErr w:type="spellEnd"/>
+      <w:r>
+        <w:rPr>
+          <w:lang w:val="en-US"/>
+        </w:rPr>
+        <w:t>. Discuss.</w:t>
+      </w:r>
+    </w:p>
+    <w:p>
+      <w:pPr>
+        <w:rPr>
+          <w:lang w:val="en-US"/>
+        </w:rPr>
+      </w:pPr>
+    </w:p>
+    <w:p>
+      <w:pPr>
+        <w:pStyle w:val="Kop1"/>
+        <w:rPr>
+          <w:lang w:val="en-US"/>
+        </w:rPr>
+      </w:pPr>
+      <w:r>
+        <w:rPr>
+          <w:lang w:val="en-US"/>
+        </w:rPr>
+        <w:t>RESPONSE</w:t>
+      </w:r>
+    </w:p>
+    <w:p>
+      <w:pPr>
+        <w:rPr>
+          <w:b/>
+          <w:bCs/>
+          <w:lang w:val="en-US"/>
+        </w:rPr>
+      </w:pPr>
+      <w:r>
+        <w:rPr>
+          <w:b/>
+          <w:bCs/>
+          <w:lang w:val="en-US"/>
+        </w:rPr>
+        <w:t>Package (element) states</w:t>
+      </w:r>
+    </w:p>
+    <w:p>
+      <w:pPr>
+        <w:rPr>
+          <w:lang w:val="en-US"/>
+        </w:rPr>
+      </w:pPr>
+      <w:r>
+        <w:rPr>
+          <w:lang w:val="en-US"/>
+        </w:rPr>
+        <w:t xml:space="preserve">CGantert345: </w:t>
+      </w:r>
+      <w:r>
+        <w:rPr>
+          <w:lang w:val="en-US"/>
+        </w:rPr>
+        <w:t>OSDM covers these states of PACKAGE ELEMENTs. How do they relate to OTI?</w:t>
+      </w:r>
+    </w:p>
+    <w:p>
+      <w:pPr>
+        <w:rPr>
+          <w:lang w:val="en-US"/>
+        </w:rPr>
+      </w:pPr>
+      <w:r>
+        <w:rPr>
+          <w:lang w:val="en-US"/>
+        </w:rPr>
+        <w:t>#0"PREBOOKED"</w:t>
+      </w:r>
+      <w:r>
+        <w:rPr>
+          <w:lang w:val="en-US"/>
+        </w:rPr>
+        <w:br/>
+      </w:r>
+      <w:hyperlink r:id="rId6" w:history="1">
+        <w:r>
+          <w:rPr>
+            <w:rStyle w:val="Hyperlink"/>
+            <w:lang w:val="en-US"/>
+          </w:rPr>
+          <w:t>#1</w:t>
+        </w:r>
+      </w:hyperlink>
+      <w:r>
+        <w:rPr>
+          <w:lang w:val="en-US"/>
+        </w:rPr>
+        <w:t>"ON_HOLD"</w:t>
+      </w:r>
+      <w:r>
+        <w:rPr>
+          <w:lang w:val="en-US"/>
+        </w:rPr>
+        <w:br/>
+      </w:r>
+      <w:hyperlink r:id="rId7" w:history="1">
+        <w:r>
+          <w:rPr>
+            <w:rStyle w:val="Hyperlink"/>
+            <w:lang w:val="en-US"/>
+          </w:rPr>
+          <w:t>#2</w:t>
+        </w:r>
+      </w:hyperlink>
+      <w:r>
+        <w:rPr>
+          <w:lang w:val="en-US"/>
+        </w:rPr>
+        <w:t>"CONFIRMED"</w:t>
+      </w:r>
+      <w:r>
+        <w:rPr>
+          <w:lang w:val="en-US"/>
+        </w:rPr>
+        <w:br/>
+      </w:r>
+      <w:hyperlink r:id="rId8" w:history="1">
+        <w:r>
+          <w:rPr>
+            <w:rStyle w:val="Hyperlink"/>
+            <w:lang w:val="en-US"/>
+          </w:rPr>
+          <w:t>#3</w:t>
+        </w:r>
+      </w:hyperlink>
+      <w:r>
+        <w:rPr>
+          <w:lang w:val="en-US"/>
+        </w:rPr>
+        <w:t>"FULFILLED"</w:t>
+      </w:r>
+      <w:r>
+        <w:rPr>
+          <w:lang w:val="en-US"/>
+        </w:rPr>
+        <w:br/>
+      </w:r>
+      <w:hyperlink r:id="rId9" w:history="1">
+        <w:r>
+          <w:rPr>
+            <w:rStyle w:val="Hyperlink"/>
+            <w:lang w:val="en-US"/>
+          </w:rPr>
+          <w:t>#4</w:t>
+        </w:r>
+      </w:hyperlink>
+      <w:r>
+        <w:rPr>
+          <w:lang w:val="en-US"/>
+        </w:rPr>
+        <w:t>"CANCELLED"</w:t>
+      </w:r>
+      <w:r>
+        <w:rPr>
+          <w:lang w:val="en-US"/>
+        </w:rPr>
+        <w:br/>
+      </w:r>
+      <w:hyperlink r:id="rId10" w:history="1">
+        <w:r>
+          <w:rPr>
+            <w:rStyle w:val="Hyperlink"/>
+            <w:lang w:val="en-US"/>
+          </w:rPr>
+          <w:t>#5</w:t>
+        </w:r>
+      </w:hyperlink>
+      <w:r>
+        <w:rPr>
+          <w:lang w:val="en-US"/>
+        </w:rPr>
+        <w:t>"RELEASED"</w:t>
+      </w:r>
+      <w:r>
+        <w:rPr>
+          <w:lang w:val="en-US"/>
+        </w:rPr>
+        <w:br/>
+      </w:r>
+      <w:hyperlink r:id="rId11" w:history="1">
+        <w:r>
+          <w:rPr>
+            <w:rStyle w:val="Hyperlink"/>
+            <w:lang w:val="en-US"/>
+          </w:rPr>
+          <w:t>#6</w:t>
+        </w:r>
+      </w:hyperlink>
+      <w:r>
+        <w:rPr>
+          <w:lang w:val="en-US"/>
+        </w:rPr>
+        <w:t>"REFUNDED"</w:t>
+      </w:r>
+      <w:r>
+        <w:rPr>
+          <w:lang w:val="en-US"/>
+        </w:rPr>
+        <w:br/>
+      </w:r>
+      <w:hyperlink r:id="rId12" w:history="1">
+        <w:r>
+          <w:rPr>
+            <w:rStyle w:val="Hyperlink"/>
+            <w:lang w:val="en-US"/>
+          </w:rPr>
+          <w:t>#7</w:t>
+        </w:r>
+      </w:hyperlink>
+      <w:r>
+        <w:rPr>
+          <w:lang w:val="en-US"/>
+        </w:rPr>
+        <w:t>"EXCHANGE_ONGOING"</w:t>
+      </w:r>
+      <w:r>
+        <w:rPr>
+          <w:lang w:val="en-US"/>
+        </w:rPr>
+        <w:br/>
+      </w:r>
+      <w:hyperlink r:id="rId13" w:history="1">
+        <w:r>
+          <w:rPr>
+            <w:rStyle w:val="Hyperlink"/>
+            <w:lang w:val="en-US"/>
+          </w:rPr>
+          <w:t>#8</w:t>
+        </w:r>
+      </w:hyperlink>
+      <w:r>
+        <w:rPr>
+          <w:lang w:val="en-US"/>
+        </w:rPr>
+        <w:t>"EXCHANGED"</w:t>
+      </w:r>
+      <w:r>
+        <w:rPr>
+          <w:lang w:val="en-US"/>
+        </w:rPr>
+        <w:br/>
+      </w:r>
+      <w:hyperlink r:id="rId14" w:history="1">
+        <w:r>
+          <w:rPr>
+            <w:rStyle w:val="Hyperlink"/>
+            <w:lang w:val="en-US"/>
+          </w:rPr>
+          <w:t>#9</w:t>
+        </w:r>
+      </w:hyperlink>
+      <w:r>
+        <w:rPr>
+          <w:lang w:val="en-US"/>
+        </w:rPr>
+        <w:t>"ERROR"</w:t>
+      </w:r>
+    </w:p>
+    <w:p>
+      <w:pPr>
+        <w:rPr>
+          <w:lang w:val="en-US"/>
+        </w:rPr>
+      </w:pPr>
+      <w:r>
+        <w:rPr>
+          <w:lang w:val="en-US"/>
+        </w:rPr>
+        <w:t>Prebooked -&gt; locked</w:t>
+      </w:r>
+    </w:p>
+    <w:p>
+      <w:pPr>
+        <w:rPr>
+          <w:lang w:val="en-US"/>
+        </w:rPr>
+      </w:pPr>
+      <w:proofErr w:type="spellStart"/>
+      <w:r>
+        <w:rPr>
+          <w:lang w:val="en-US"/>
+        </w:rPr>
+        <w:t>On_hold</w:t>
+      </w:r>
+      <w:proofErr w:type="spellEnd"/>
+      <w:r>
+        <w:rPr>
+          <w:lang w:val="en-US"/>
+        </w:rPr>
+        <w:t xml:space="preserve"> -&gt; ?</w:t>
+      </w:r>
+    </w:p>
+    <w:p>
+      <w:pPr>
+        <w:rPr>
+          <w:lang w:val="en-US"/>
+        </w:rPr>
+      </w:pPr>
+      <w:r>
+        <w:rPr>
+          <w:lang w:val="en-US"/>
+        </w:rPr>
+        <w:t>Confirmed -&gt; purchased</w:t>
+      </w:r>
+    </w:p>
+    <w:p>
+      <w:pPr>
+        <w:rPr>
+          <w:lang w:val="en-US"/>
+        </w:rPr>
+      </w:pPr>
+      <w:r>
+        <w:rPr>
+          <w:lang w:val="en-US"/>
+        </w:rPr>
+        <w:t>Fulfilled -&gt; purchased &amp; fulfilments issued</w:t>
+      </w:r>
+    </w:p>
+    <w:p>
+      <w:pPr>
+        <w:rPr>
+          <w:lang w:val="en-US"/>
+        </w:rPr>
+      </w:pPr>
+      <w:r>
+        <w:rPr>
+          <w:lang w:val="en-US"/>
+        </w:rPr>
+        <w:t>Cancelled -&gt; cancelled</w:t>
+      </w:r>
+    </w:p>
+    <w:p>
+      <w:pPr>
+        <w:rPr>
+          <w:lang w:val="en-US"/>
+        </w:rPr>
+      </w:pPr>
+      <w:r>
+        <w:rPr>
+          <w:lang w:val="en-US"/>
+        </w:rPr>
+        <w:t>Released -&gt; ? Released (from locked state)</w:t>
+      </w:r>
+    </w:p>
+    <w:p>
+      <w:pPr>
+        <w:rPr>
+          <w:lang w:val="en-US"/>
+        </w:rPr>
+      </w:pPr>
+      <w:r>
+        <w:rPr>
+          <w:lang w:val="en-US"/>
+        </w:rPr>
+        <w:lastRenderedPageBreak/>
+        <w:t>Refunded -&gt; not applicable, the refund is a retailer task</w:t>
+      </w:r>
+    </w:p>
+    <w:p>
+      <w:pPr>
+        <w:rPr>
+          <w:lang w:val="en-US"/>
+        </w:rPr>
+      </w:pPr>
+      <w:proofErr w:type="spellStart"/>
+      <w:r>
+        <w:rPr>
+          <w:lang w:val="en-US"/>
+        </w:rPr>
+        <w:t>Exchange_ongoing</w:t>
+      </w:r>
+      <w:proofErr w:type="spellEnd"/>
+      <w:r>
+        <w:rPr>
+          <w:lang w:val="en-US"/>
+        </w:rPr>
+        <w:t xml:space="preserve"> -&gt; after the initiate exchange</w:t>
+      </w:r>
+    </w:p>
+    <w:p>
+      <w:pPr>
+        <w:rPr>
+          <w:lang w:val="en-US"/>
+        </w:rPr>
+      </w:pPr>
+      <w:r>
+        <w:rPr>
+          <w:lang w:val="en-US"/>
+        </w:rPr>
+        <w:t>Exchanged -&gt; a package element is exchanged (is it needed to know it is exchanged or cancelled?)</w:t>
+      </w:r>
+    </w:p>
+    <w:p>
+      <w:pPr>
+        <w:rPr>
+          <w:lang w:val="en-US"/>
+        </w:rPr>
+      </w:pPr>
+      <w:r>
+        <w:rPr>
+          <w:lang w:val="en-US"/>
+        </w:rPr>
+        <w:t>Error -&gt; (internal state?)</w:t>
+      </w:r>
+    </w:p>
+    <w:p>
+      <w:pPr>
+        <w:rPr>
+          <w:lang w:val="en-US"/>
+        </w:rPr>
+      </w:pPr>
+    </w:p>
+    <w:p>
+      <w:pPr>
+        <w:rPr>
+          <w:lang w:val="en-US"/>
+        </w:rPr>
+      </w:pPr>
+      <w:proofErr w:type="spellStart"/>
+      <w:r>
+        <w:rPr>
+          <w:lang w:val="en-US"/>
+        </w:rPr>
+        <w:t>Edwinvandenbelt</w:t>
+      </w:r>
+      <w:proofErr w:type="spellEnd"/>
+      <w:r>
+        <w:rPr>
+          <w:lang w:val="en-US"/>
+        </w:rPr>
         <w:t xml:space="preserve">: </w:t>
       </w:r>
       <w:r>
         <w:rPr>
           <w:lang w:val="en-US"/>
         </w:rPr>
-        <w:t xml:space="preserve">The list of trip sections for the offers is missing in the </w:t>
-      </w:r>
-      <w:proofErr w:type="spellStart"/>
-      <w:r>
-        <w:rPr>
-          <w:lang w:val="en-US"/>
-        </w:rPr>
-        <w:t>SearchOfferFilters</w:t>
-      </w:r>
-      <w:proofErr w:type="spellEnd"/>
-    </w:p>
-    <w:p>
-      <w:pPr>
-        <w:rPr>
-          <w:lang w:val="en-US"/>
-        </w:rPr>
-      </w:pPr>
-      <w:proofErr w:type="spellStart"/>
-      <w:r>
-        <w:rPr>
-          <w:lang w:val="en-US"/>
-        </w:rPr>
-        <w:t>Edwinvandenbelt</w:t>
-      </w:r>
-      <w:proofErr w:type="spellEnd"/>
-      <w:r>
-        <w:rPr>
-          <w:lang w:val="en-US"/>
-        </w:rPr>
-        <w:t xml:space="preserve">: it is now directly in the </w:t>
-      </w:r>
-      <w:proofErr w:type="spellStart"/>
-      <w:r>
-        <w:rPr>
-          <w:lang w:val="en-US"/>
-        </w:rPr>
-        <w:t>searchofferrequest</w:t>
-      </w:r>
-      <w:proofErr w:type="spellEnd"/>
-      <w:r>
-        <w:rPr>
-          <w:lang w:val="en-US"/>
-        </w:rPr>
-        <w:t>. Discuss.</w:t>
-      </w:r>
+        <w:t>Possible states now:</w:t>
+      </w:r>
+    </w:p>
+    <w:p>
+      <w:pPr>
+        <w:rPr>
+          <w:lang w:val="en-US"/>
+        </w:rPr>
+      </w:pPr>
+      <w:r>
+        <w:rPr>
+          <w:lang w:val="en-US"/>
+        </w:rPr>
+        <w:t xml:space="preserve">Offered </w:t>
+      </w:r>
+    </w:p>
+    <w:p>
+      <w:pPr>
+        <w:rPr>
+          <w:lang w:val="en-US"/>
+        </w:rPr>
+      </w:pPr>
+      <w:r>
+        <w:rPr>
+          <w:lang w:val="en-US"/>
+        </w:rPr>
+        <w:t>Locked (+ Non happy flow: Released)</w:t>
+      </w:r>
+    </w:p>
+    <w:p>
+      <w:pPr>
+        <w:rPr>
+          <w:lang w:val="en-US"/>
+        </w:rPr>
+      </w:pPr>
+      <w:r>
+        <w:rPr>
+          <w:lang w:val="en-US"/>
+        </w:rPr>
+        <w:t xml:space="preserve">Validated (after the pre-purchase validation, </w:t>
+      </w:r>
+      <w:proofErr w:type="spellStart"/>
+      <w:r>
+        <w:rPr>
+          <w:lang w:val="en-US"/>
+        </w:rPr>
+        <w:t>non happy</w:t>
+      </w:r>
+      <w:proofErr w:type="spellEnd"/>
+      <w:r>
+        <w:rPr>
+          <w:lang w:val="en-US"/>
+        </w:rPr>
+        <w:t xml:space="preserve"> flow: locked)</w:t>
+      </w:r>
+    </w:p>
+    <w:p>
+      <w:pPr>
+        <w:rPr>
+          <w:lang w:val="en-US"/>
+        </w:rPr>
+      </w:pPr>
+      <w:r>
+        <w:rPr>
+          <w:lang w:val="en-US"/>
+        </w:rPr>
+        <w:t>Purchased (or confirmed, non-happy flow: validated)</w:t>
+      </w:r>
+    </w:p>
+    <w:p>
+      <w:pPr>
+        <w:rPr>
+          <w:lang w:val="en-US"/>
+        </w:rPr>
+      </w:pPr>
+      <w:proofErr w:type="spellStart"/>
+      <w:r>
+        <w:rPr>
+          <w:lang w:val="en-US"/>
+        </w:rPr>
+        <w:t>Cancellation_ongoing</w:t>
+      </w:r>
+      <w:proofErr w:type="spellEnd"/>
+      <w:r>
+        <w:rPr>
+          <w:lang w:val="en-US"/>
+        </w:rPr>
+        <w:t xml:space="preserve"> (after the initiation of the cancellation; non happy: purchased)</w:t>
+      </w:r>
+    </w:p>
+    <w:p>
+      <w:pPr>
+        <w:rPr>
+          <w:lang w:val="en-US"/>
+        </w:rPr>
+      </w:pPr>
+      <w:proofErr w:type="spellStart"/>
+      <w:r>
+        <w:rPr>
+          <w:lang w:val="en-US"/>
+        </w:rPr>
+        <w:t>Exchange</w:t>
+      </w:r>
+      <w:r>
+        <w:rPr>
+          <w:lang w:val="en-US"/>
+        </w:rPr>
+        <w:t>_ongoing</w:t>
+      </w:r>
+      <w:proofErr w:type="spellEnd"/>
+      <w:r>
+        <w:rPr>
+          <w:lang w:val="en-US"/>
+        </w:rPr>
+        <w:t xml:space="preserve"> (after the initiation of the </w:t>
+      </w:r>
+      <w:r>
+        <w:rPr>
+          <w:lang w:val="en-US"/>
+        </w:rPr>
+        <w:t>exchange</w:t>
+      </w:r>
+      <w:r>
+        <w:rPr>
+          <w:lang w:val="en-US"/>
+        </w:rPr>
+        <w:t>; non happy: purchased)</w:t>
+      </w:r>
+    </w:p>
+    <w:p>
+      <w:pPr>
+        <w:rPr>
+          <w:lang w:val="en-US"/>
+        </w:rPr>
+      </w:pPr>
+      <w:r>
+        <w:rPr>
+          <w:lang w:val="en-US"/>
+        </w:rPr>
+        <w:t xml:space="preserve">Cancelled (after a (partial) cancellation + reason!, </w:t>
+      </w:r>
+      <w:proofErr w:type="spellStart"/>
+      <w:r>
+        <w:rPr>
+          <w:lang w:val="en-US"/>
+        </w:rPr>
+        <w:t>non happy</w:t>
+      </w:r>
+      <w:proofErr w:type="spellEnd"/>
+      <w:r>
+        <w:rPr>
+          <w:lang w:val="en-US"/>
+        </w:rPr>
+        <w:t>: purchased)</w:t>
+      </w:r>
+    </w:p>
+    <w:p>
+      <w:pPr>
+        <w:rPr>
+          <w:lang w:val="en-US"/>
+        </w:rPr>
+      </w:pPr>
+      <w:r>
+        <w:rPr>
+          <w:lang w:val="en-US"/>
+        </w:rPr>
+        <w:t>Exchanged</w:t>
+      </w:r>
+      <w:r>
+        <w:rPr>
+          <w:lang w:val="en-US"/>
+        </w:rPr>
+        <w:t xml:space="preserve"> (after a (partial) exchange, </w:t>
+      </w:r>
+      <w:proofErr w:type="spellStart"/>
+      <w:r>
+        <w:rPr>
+          <w:lang w:val="en-US"/>
+        </w:rPr>
+        <w:t>non happy</w:t>
+      </w:r>
+      <w:proofErr w:type="spellEnd"/>
+      <w:r>
+        <w:rPr>
+          <w:lang w:val="en-US"/>
+        </w:rPr>
+        <w:t>: purchased)</w:t>
+      </w:r>
+    </w:p>
+    <w:p>
+      <w:pPr>
+        <w:rPr>
+          <w:b/>
+          <w:bCs/>
+          <w:lang w:val="en-US"/>
+        </w:rPr>
+      </w:pPr>
+    </w:p>
+    <w:p>
+      <w:pPr>
+        <w:rPr>
+          <w:b/>
+          <w:bCs/>
+          <w:lang w:val="en-US"/>
+        </w:rPr>
+      </w:pPr>
+      <w:r>
+        <w:rPr>
+          <w:b/>
+          <w:bCs/>
+          <w:lang w:val="en-US"/>
+        </w:rPr>
+        <w:t>Product</w:t>
+      </w:r>
+      <w:r>
+        <w:rPr>
+          <w:b/>
+          <w:bCs/>
+          <w:lang w:val="en-US"/>
+        </w:rPr>
+        <w:t xml:space="preserve"> definition</w:t>
+      </w:r>
+    </w:p>
+    <w:p>
+      <w:pPr>
+        <w:rPr>
+          <w:lang w:val="en-US"/>
+        </w:rPr>
+      </w:pPr>
+      <w:hyperlink r:id="rId15" w:history="1">
+        <w:r>
+          <w:rPr>
+            <w:rStyle w:val="Hyperlink"/>
+            <w:lang w:val="en-US"/>
+          </w:rPr>
+          <w:t>CGantert345</w:t>
+        </w:r>
+      </w:hyperlink>
+      <w:r>
+        <w:rPr>
+          <w:lang w:val="en-US"/>
+        </w:rPr>
+        <w:t xml:space="preserve">: </w:t>
+      </w:r>
+      <w:r>
+        <w:rPr>
+          <w:lang w:val="en-US"/>
+        </w:rPr>
+        <w:t>Product needs a lot more details:</w:t>
+      </w:r>
+    </w:p>
+    <w:p>
+      <w:pPr>
+        <w:rPr>
+          <w:lang w:val="en-US"/>
+        </w:rPr>
+      </w:pPr>
+      <w:r>
+        <w:rPr>
+          <w:lang w:val="en-US"/>
+        </w:rPr>
+        <w:t xml:space="preserve">    summary:</w:t>
+      </w:r>
+    </w:p>
+    <w:p>
+      <w:pPr>
+        <w:rPr>
+          <w:lang w:val="en-US"/>
+        </w:rPr>
+      </w:pPr>
+      <w:r>
+        <w:rPr>
+          <w:lang w:val="en-US"/>
+        </w:rPr>
+        <w:t xml:space="preserve">      description: |</w:t>
+      </w:r>
+    </w:p>
+    <w:p>
+      <w:pPr>
+        <w:rPr>
+          <w:lang w:val="en-US"/>
+        </w:rPr>
+      </w:pPr>
+      <w:r>
+        <w:rPr>
+          <w:lang w:val="en-US"/>
+        </w:rPr>
+        <w:t xml:space="preserve">        A human-readable description of the product.</w:t>
+      </w:r>
+    </w:p>
+    <w:p>
+      <w:r>
+        <w:rPr>
+          <w:lang w:val="en-US"/>
+        </w:rPr>
+        <w:t xml:space="preserve">    </w:t>
+      </w:r>
+      <w:r>
+        <w:t>type:</w:t>
+      </w:r>
+    </w:p>
+    <w:p>
+      <w:r>
+        <w:t xml:space="preserve">  x-</w:t>
+      </w:r>
+      <w:proofErr w:type="spellStart"/>
+      <w:r>
+        <w:t>extensible</w:t>
+      </w:r>
+      <w:proofErr w:type="spellEnd"/>
+      <w:r>
+        <w:t>-</w:t>
+      </w:r>
+      <w:proofErr w:type="spellStart"/>
+      <w:r>
+        <w:t>enum</w:t>
+      </w:r>
+      <w:proofErr w:type="spellEnd"/>
+      <w:r>
+        <w:t>:</w:t>
+      </w:r>
+    </w:p>
+    <w:p>
+      <w:r>
+        <w:t xml:space="preserve">    - ADMISSION_PASS</w:t>
+      </w:r>
+    </w:p>
+    <w:p>
+      <w:r>
+        <w:t xml:space="preserve">    - ADMISSION_MULTI_RIDE</w:t>
+      </w:r>
+    </w:p>
+    <w:p>
+      <w:r>
+        <w:t xml:space="preserve">    - ADMISSION_POINT2POINT</w:t>
+      </w:r>
+    </w:p>
+    <w:p>
+      <w:r>
+        <w:t xml:space="preserve">    - UPGRADE_PASS</w:t>
+      </w:r>
+    </w:p>
+    <w:p>
+      <w:pPr>
+        <w:rPr>
+          <w:lang w:val="en-US"/>
+        </w:rPr>
+      </w:pPr>
+      <w:r>
+        <w:t xml:space="preserve">    </w:t>
+      </w:r>
+      <w:r>
+        <w:rPr>
+          <w:lang w:val="en-US"/>
+        </w:rPr>
+        <w:t>- UPGRADE_MULTI_RIDE</w:t>
+      </w:r>
+    </w:p>
+    <w:p>
+      <w:pPr>
+        <w:rPr>
+          <w:lang w:val="en-US"/>
+        </w:rPr>
+      </w:pPr>
+      <w:r>
+        <w:rPr>
+          <w:lang w:val="en-US"/>
+        </w:rPr>
+        <w:lastRenderedPageBreak/>
+        <w:t xml:space="preserve">    - UPGRADE_POINT2POINT</w:t>
+      </w:r>
+    </w:p>
+    <w:p>
+      <w:pPr>
+        <w:rPr>
+          <w:lang w:val="en-US"/>
+        </w:rPr>
+      </w:pPr>
+      <w:r>
+        <w:rPr>
+          <w:lang w:val="en-US"/>
+        </w:rPr>
+        <w:t xml:space="preserve">    - RESERVATION</w:t>
+      </w:r>
+    </w:p>
+    <w:p>
+      <w:pPr>
+        <w:rPr>
+          <w:lang w:val="en-US"/>
+        </w:rPr>
+      </w:pPr>
+      <w:r>
+        <w:rPr>
+          <w:lang w:val="en-US"/>
+        </w:rPr>
+        <w:t xml:space="preserve">    - ANCILLARY_SERVICE</w:t>
+      </w:r>
+    </w:p>
+    <w:p>
+      <w:pPr>
+        <w:rPr>
+          <w:lang w:val="en-US"/>
+        </w:rPr>
+      </w:pPr>
+      <w:r>
+        <w:rPr>
+          <w:lang w:val="en-US"/>
+        </w:rPr>
+        <w:t xml:space="preserve">    - ANCILLARY_ITEM</w:t>
+      </w:r>
+    </w:p>
+    <w:p>
+      <w:pPr>
+        <w:rPr>
+          <w:lang w:val="en-US"/>
+        </w:rPr>
+      </w:pPr>
+      <w:r>
+        <w:rPr>
+          <w:lang w:val="en-US"/>
+        </w:rPr>
+        <w:t xml:space="preserve">    - REDUCTION_CARD</w:t>
+      </w:r>
+    </w:p>
+    <w:p>
+      <w:pPr>
+        <w:rPr>
+          <w:lang w:val="en-US"/>
+        </w:rPr>
+      </w:pPr>
+      <w:r>
+        <w:rPr>
+          <w:lang w:val="en-US"/>
+        </w:rPr>
+        <w:t xml:space="preserve">    code:        The product code expressed in the provider system (could be a</w:t>
+      </w:r>
+    </w:p>
+    <w:p>
+      <w:pPr>
+        <w:rPr>
+          <w:lang w:val="en-US"/>
+        </w:rPr>
+      </w:pPr>
+      <w:r>
+        <w:rPr>
+          <w:lang w:val="en-US"/>
+        </w:rPr>
+        <w:t xml:space="preserve">        mapping from an even lower-level provider).</w:t>
+      </w:r>
+    </w:p>
+    <w:p>
+      <w:pPr>
+        <w:rPr>
+          <w:lang w:val="en-US"/>
+        </w:rPr>
+      </w:pPr>
+      <w:r>
+        <w:rPr>
+          <w:lang w:val="en-US"/>
+        </w:rPr>
+        <w:t xml:space="preserve">      examples:</w:t>
+      </w:r>
+    </w:p>
+    <w:p>
+      <w:pPr>
+        <w:rPr>
+          <w:lang w:val="en-US"/>
+        </w:rPr>
+      </w:pPr>
+      <w:r>
+        <w:rPr>
+          <w:lang w:val="en-US"/>
+        </w:rPr>
+        <w:t xml:space="preserve">        - PT00AD</w:t>
+      </w:r>
+    </w:p>
+    <w:p>
+      <w:pPr>
+        <w:rPr>
+          <w:lang w:val="en-US"/>
+        </w:rPr>
+      </w:pPr>
+      <w:r>
+        <w:rPr>
+          <w:lang w:val="en-US"/>
+        </w:rPr>
+        <w:t xml:space="preserve">    description:          Textual description of the product.</w:t>
+      </w:r>
+    </w:p>
+    <w:p>
+      <w:pPr>
+        <w:rPr>
+          <w:lang w:val="en-US"/>
+        </w:rPr>
+      </w:pPr>
+      <w:r>
+        <w:rPr>
+          <w:lang w:val="en-US"/>
+        </w:rPr>
+        <w:t xml:space="preserve">    owner:          $ref: '#/components/schemas/</w:t>
+      </w:r>
+      <w:proofErr w:type="spellStart"/>
+      <w:r>
+        <w:rPr>
+          <w:lang w:val="en-US"/>
+        </w:rPr>
+        <w:t>CompanyRef</w:t>
+      </w:r>
+      <w:proofErr w:type="spellEnd"/>
+      <w:r>
+        <w:rPr>
+          <w:lang w:val="en-US"/>
+        </w:rPr>
+        <w:t>'</w:t>
+      </w:r>
+    </w:p>
+    <w:p>
+      <w:pPr>
+        <w:rPr>
+          <w:lang w:val="en-US"/>
+        </w:rPr>
+      </w:pPr>
+      <w:r>
+        <w:rPr>
+          <w:lang w:val="en-US"/>
+        </w:rPr>
+        <w:t xml:space="preserve">    conditions:</w:t>
+      </w:r>
+    </w:p>
+    <w:p>
+      <w:pPr>
+        <w:rPr>
+          <w:lang w:val="en-US"/>
+        </w:rPr>
+      </w:pPr>
+      <w:r>
+        <w:rPr>
+          <w:lang w:val="en-US"/>
+        </w:rPr>
+        <w:t xml:space="preserve">      description: |</w:t>
+      </w:r>
+    </w:p>
+    <w:p>
+      <w:pPr>
+        <w:rPr>
+          <w:lang w:val="en-US"/>
+        </w:rPr>
+      </w:pPr>
+      <w:r>
+        <w:rPr>
+          <w:lang w:val="en-US"/>
+        </w:rPr>
+        <w:t xml:space="preserve">        description of the sales or after-sales conditions.</w:t>
+      </w:r>
+    </w:p>
+    <w:p>
+      <w:pPr>
+        <w:rPr>
+          <w:lang w:val="en-US"/>
+        </w:rPr>
+      </w:pPr>
+      <w:r>
+        <w:rPr>
+          <w:lang w:val="en-US"/>
+        </w:rPr>
+        <w:t xml:space="preserve">      type: array</w:t>
+      </w:r>
+    </w:p>
+    <w:p>
+      <w:pPr>
+        <w:rPr>
+          <w:lang w:val="en-US"/>
+        </w:rPr>
+      </w:pPr>
+      <w:r>
+        <w:rPr>
+          <w:lang w:val="en-US"/>
+        </w:rPr>
+        <w:t xml:space="preserve">      items:</w:t>
+      </w:r>
+    </w:p>
+    <w:p>
+      <w:pPr>
+        <w:rPr>
+          <w:lang w:val="en-US"/>
+        </w:rPr>
+      </w:pPr>
+      <w:r>
+        <w:rPr>
+          <w:lang w:val="en-US"/>
+        </w:rPr>
+        <w:t xml:space="preserve">        $ref: '#/components/schemas/Condition'</w:t>
+      </w:r>
+    </w:p>
+    <w:p>
+      <w:pPr>
+        <w:rPr>
+          <w:lang w:val="en-US"/>
+        </w:rPr>
+      </w:pPr>
+      <w:r>
+        <w:rPr>
+          <w:lang w:val="en-US"/>
+        </w:rPr>
+        <w:t xml:space="preserve">    flexibility:</w:t>
+      </w:r>
+    </w:p>
+    <w:p>
+      <w:pPr>
+        <w:rPr>
+          <w:lang w:val="en-US"/>
+        </w:rPr>
+      </w:pPr>
+      <w:r>
+        <w:rPr>
+          <w:lang w:val="en-US"/>
+        </w:rPr>
+        <w:t xml:space="preserve">        x-extensible-</w:t>
+      </w:r>
+      <w:proofErr w:type="spellStart"/>
+      <w:r>
+        <w:rPr>
+          <w:lang w:val="en-US"/>
+        </w:rPr>
+        <w:t>enum</w:t>
+      </w:r>
+      <w:proofErr w:type="spellEnd"/>
+      <w:r>
+        <w:rPr>
+          <w:lang w:val="en-US"/>
+        </w:rPr>
+        <w:t>:</w:t>
+      </w:r>
+    </w:p>
+    <w:p>
+      <w:pPr>
+        <w:rPr>
+          <w:lang w:val="en-US"/>
+        </w:rPr>
+      </w:pPr>
+      <w:r>
+        <w:rPr>
+          <w:lang w:val="en-US"/>
+        </w:rPr>
+        <w:t xml:space="preserve">         - FULL_FLEXIBLE</w:t>
+      </w:r>
+    </w:p>
+    <w:p>
+      <w:pPr>
+        <w:rPr>
+          <w:lang w:val="fr-FR"/>
+        </w:rPr>
+      </w:pPr>
+      <w:r>
+        <w:rPr>
+          <w:lang w:val="en-US"/>
+        </w:rPr>
+        <w:t xml:space="preserve">         </w:t>
+      </w:r>
+      <w:r>
+        <w:rPr>
+          <w:lang w:val="fr-FR"/>
+        </w:rPr>
+        <w:t>- SEMI_FLEXIBLE</w:t>
+      </w:r>
+    </w:p>
+    <w:p>
+      <w:pPr>
+        <w:rPr>
+          <w:lang w:val="fr-FR"/>
+        </w:rPr>
+      </w:pPr>
+      <w:r>
+        <w:rPr>
+          <w:lang w:val="fr-FR"/>
+        </w:rPr>
+        <w:t xml:space="preserve">         - NON_FLEXIBLE</w:t>
+      </w:r>
+    </w:p>
+    <w:p>
+      <w:pPr>
+        <w:rPr>
+          <w:lang w:val="fr-FR"/>
+        </w:rPr>
+      </w:pPr>
+      <w:r>
+        <w:rPr>
+          <w:lang w:val="fr-FR"/>
+        </w:rPr>
+        <w:t xml:space="preserve">    </w:t>
+      </w:r>
+      <w:proofErr w:type="spellStart"/>
+      <w:r>
+        <w:rPr>
+          <w:lang w:val="fr-FR"/>
+        </w:rPr>
+        <w:t>serviceClass</w:t>
+      </w:r>
+      <w:proofErr w:type="spellEnd"/>
+      <w:r>
+        <w:rPr>
+          <w:lang w:val="fr-FR"/>
+        </w:rPr>
+        <w:t>:</w:t>
+      </w:r>
+    </w:p>
+    <w:p>
+      <w:pPr>
+        <w:rPr>
+          <w:lang w:val="en-US"/>
+        </w:rPr>
+      </w:pPr>
+      <w:r>
+        <w:rPr>
+          <w:lang w:val="fr-FR"/>
+        </w:rPr>
+        <w:t xml:space="preserve">      </w:t>
+      </w:r>
+      <w:r>
+        <w:rPr>
+          <w:lang w:val="en-US"/>
+        </w:rPr>
+        <w:t>$ref: '#/components/schemas/</w:t>
+      </w:r>
+      <w:proofErr w:type="spellStart"/>
+      <w:r>
+        <w:rPr>
+          <w:lang w:val="en-US"/>
+        </w:rPr>
+        <w:t>ServiceClass</w:t>
+      </w:r>
+      <w:proofErr w:type="spellEnd"/>
+      <w:r>
+        <w:rPr>
+          <w:lang w:val="en-US"/>
+        </w:rPr>
+        <w:t>'</w:t>
+      </w:r>
+    </w:p>
+    <w:p>
+      <w:pPr>
+        <w:rPr>
+          <w:lang w:val="en-US"/>
+        </w:rPr>
+      </w:pPr>
+      <w:r>
+        <w:rPr>
+          <w:lang w:val="en-US"/>
+        </w:rPr>
+        <w:t xml:space="preserve">    </w:t>
+      </w:r>
+      <w:proofErr w:type="spellStart"/>
+      <w:r>
+        <w:rPr>
+          <w:lang w:val="en-US"/>
+        </w:rPr>
+        <w:t>travelClass</w:t>
+      </w:r>
+      <w:proofErr w:type="spellEnd"/>
+      <w:r>
+        <w:rPr>
+          <w:lang w:val="en-US"/>
+        </w:rPr>
+        <w:t>:</w:t>
+      </w:r>
+    </w:p>
+    <w:p>
+      <w:pPr>
+        <w:rPr>
+          <w:lang w:val="en-US"/>
+        </w:rPr>
+      </w:pPr>
+      <w:r>
+        <w:rPr>
+          <w:lang w:val="en-US"/>
+        </w:rPr>
+        <w:t xml:space="preserve">      $ref: '#/components/schemas/</w:t>
+      </w:r>
+      <w:proofErr w:type="spellStart"/>
+      <w:r>
+        <w:rPr>
+          <w:lang w:val="en-US"/>
+        </w:rPr>
+        <w:t>TravelClass</w:t>
+      </w:r>
+      <w:proofErr w:type="spellEnd"/>
+      <w:r>
+        <w:rPr>
+          <w:lang w:val="en-US"/>
+        </w:rPr>
+        <w:t>'</w:t>
+      </w:r>
+    </w:p>
+    <w:p>
+      <w:pPr>
+        <w:rPr>
+          <w:lang w:val="en-US"/>
+        </w:rPr>
+      </w:pPr>
+      <w:r>
+        <w:rPr>
+          <w:lang w:val="en-US"/>
+        </w:rPr>
+        <w:t xml:space="preserve">    </w:t>
+      </w:r>
+      <w:proofErr w:type="spellStart"/>
+      <w:r>
+        <w:rPr>
+          <w:lang w:val="en-US"/>
+        </w:rPr>
+        <w:t>fulfillmentOptions</w:t>
+      </w:r>
+      <w:proofErr w:type="spellEnd"/>
+      <w:r>
+        <w:rPr>
+          <w:lang w:val="en-US"/>
+        </w:rPr>
+        <w:t>:</w:t>
+      </w:r>
+    </w:p>
+    <w:p>
+      <w:pPr>
+        <w:rPr>
+          <w:lang w:val="en-US"/>
+        </w:rPr>
+      </w:pPr>
+      <w:r>
+        <w:rPr>
+          <w:lang w:val="en-US"/>
+        </w:rPr>
+        <w:t xml:space="preserve">      type: array</w:t>
+      </w:r>
+    </w:p>
+    <w:p>
+      <w:pPr>
+        <w:rPr>
+          <w:lang w:val="en-US"/>
+        </w:rPr>
+      </w:pPr>
+      <w:r>
+        <w:rPr>
+          <w:lang w:val="en-US"/>
+        </w:rPr>
+        <w:lastRenderedPageBreak/>
+        <w:t xml:space="preserve">      items:</w:t>
+      </w:r>
+    </w:p>
+    <w:p>
+      <w:pPr>
+        <w:rPr>
+          <w:lang w:val="en-US"/>
+        </w:rPr>
+      </w:pPr>
+      <w:r>
+        <w:rPr>
+          <w:lang w:val="en-US"/>
+        </w:rPr>
+        <w:t xml:space="preserve">        $ref: '#/components/schemas/</w:t>
+      </w:r>
+      <w:proofErr w:type="spellStart"/>
+      <w:r>
+        <w:rPr>
+          <w:lang w:val="en-US"/>
+        </w:rPr>
+        <w:t>FulfillmentOption</w:t>
+      </w:r>
+      <w:proofErr w:type="spellEnd"/>
+      <w:r>
+        <w:rPr>
+          <w:lang w:val="en-US"/>
+        </w:rPr>
+        <w:t>'</w:t>
+      </w:r>
+    </w:p>
+    <w:p>
+      <w:pPr>
+        <w:rPr>
+          <w:lang w:val="en-US"/>
+        </w:rPr>
+      </w:pPr>
+      <w:r>
+        <w:rPr>
+          <w:lang w:val="en-US"/>
+        </w:rPr>
+        <w:t xml:space="preserve">    </w:t>
+      </w:r>
+      <w:proofErr w:type="spellStart"/>
+      <w:r>
+        <w:rPr>
+          <w:lang w:val="en-US"/>
+        </w:rPr>
+        <w:t>isTrainBound</w:t>
+      </w:r>
+      <w:proofErr w:type="spellEnd"/>
+      <w:r>
+        <w:rPr>
+          <w:lang w:val="en-US"/>
+        </w:rPr>
+        <w:t xml:space="preserve">:       - </w:t>
+      </w:r>
+      <w:proofErr w:type="spellStart"/>
+      <w:r>
+        <w:rPr>
+          <w:lang w:val="en-US"/>
+        </w:rPr>
+        <w:t>boolean</w:t>
+      </w:r>
+      <w:proofErr w:type="spellEnd"/>
+    </w:p>
+    <w:p>
+      <w:pPr>
+        <w:rPr>
+          <w:lang w:val="en-US"/>
+        </w:rPr>
+      </w:pPr>
+      <w:r>
+        <w:rPr>
+          <w:lang w:val="en-US"/>
+        </w:rPr>
+        <w:t xml:space="preserve">    </w:t>
+      </w:r>
+      <w:proofErr w:type="spellStart"/>
+      <w:r>
+        <w:rPr>
+          <w:lang w:val="en-US"/>
+        </w:rPr>
+        <w:t>isReturnProduct</w:t>
+      </w:r>
+      <w:proofErr w:type="spellEnd"/>
+      <w:r>
+        <w:rPr>
+          <w:lang w:val="en-US"/>
+        </w:rPr>
+        <w:t xml:space="preserve">:  - </w:t>
+      </w:r>
+      <w:proofErr w:type="spellStart"/>
+      <w:r>
+        <w:rPr>
+          <w:lang w:val="en-US"/>
+        </w:rPr>
+        <w:t>boolean</w:t>
+      </w:r>
+      <w:proofErr w:type="spellEnd"/>
+    </w:p>
+    <w:p>
+      <w:pPr>
+        <w:rPr>
+          <w:lang w:val="en-US"/>
+        </w:rPr>
+      </w:pPr>
+      <w:r>
+        <w:rPr>
+          <w:lang w:val="en-US"/>
+        </w:rPr>
+        <w:t xml:space="preserve">    </w:t>
+      </w:r>
+      <w:proofErr w:type="spellStart"/>
+      <w:r>
+        <w:rPr>
+          <w:lang w:val="en-US"/>
+        </w:rPr>
+        <w:t>serviceConstraintText</w:t>
+      </w:r>
+      <w:proofErr w:type="spellEnd"/>
+      <w:r>
+        <w:rPr>
+          <w:lang w:val="en-US"/>
+        </w:rPr>
+        <w:t>:  condition on the services to be used</w:t>
+      </w:r>
+    </w:p>
+    <w:p>
+      <w:pPr>
+        <w:rPr>
+          <w:lang w:val="en-US"/>
+        </w:rPr>
+      </w:pPr>
+      <w:r>
+        <w:rPr>
+          <w:lang w:val="en-US"/>
+        </w:rPr>
+        <w:t xml:space="preserve">    </w:t>
+      </w:r>
+      <w:proofErr w:type="spellStart"/>
+      <w:r>
+        <w:rPr>
+          <w:lang w:val="en-US"/>
+        </w:rPr>
+        <w:t>carrierConstraintText</w:t>
+      </w:r>
+      <w:proofErr w:type="spellEnd"/>
+      <w:r>
+        <w:rPr>
+          <w:lang w:val="en-US"/>
+        </w:rPr>
+        <w:t>:   condition on the carriers to be used</w:t>
+      </w:r>
+    </w:p>
+    <w:p>
+      <w:pPr>
+        <w:rPr>
+          <w:lang w:val="en-US"/>
+        </w:rPr>
+      </w:pPr>
+      <w:r>
+        <w:rPr>
+          <w:lang w:val="en-US"/>
+        </w:rPr>
+        <w:t xml:space="preserve">    </w:t>
+      </w:r>
+      <w:proofErr w:type="spellStart"/>
+      <w:r>
+        <w:rPr>
+          <w:lang w:val="en-US"/>
+        </w:rPr>
+        <w:t>combinationTags</w:t>
+      </w:r>
+      <w:proofErr w:type="spellEnd"/>
+      <w:r>
+        <w:rPr>
+          <w:lang w:val="en-US"/>
+        </w:rPr>
+        <w:t>:         governing the combination with other providers products</w:t>
+      </w:r>
+    </w:p>
+    <w:p>
+      <w:r>
+        <w:rPr>
+          <w:lang w:val="en-US"/>
+        </w:rPr>
+        <w:t xml:space="preserve">    </w:t>
+      </w:r>
+      <w:r>
+        <w:t>_links:</w:t>
+      </w:r>
+    </w:p>
+    <w:p>
+      <w:r>
+        <w:t xml:space="preserve">      $ref: '#/</w:t>
+      </w:r>
+      <w:proofErr w:type="spellStart"/>
+      <w:r>
+        <w:t>components</w:t>
+      </w:r>
+      <w:proofErr w:type="spellEnd"/>
+      <w:r>
+        <w:t>/</w:t>
+      </w:r>
+      <w:proofErr w:type="spellStart"/>
+      <w:r>
+        <w:t>schemas</w:t>
+      </w:r>
+      <w:proofErr w:type="spellEnd"/>
+      <w:r>
+        <w:t>/Links'</w:t>
+      </w:r>
+    </w:p>
+    <w:p>
+      <w:pPr>
+        <w:rPr>
+          <w:lang w:val="en-US"/>
+        </w:rPr>
+      </w:pPr>
+    </w:p>
+    <w:p>
+      <w:pPr>
+        <w:rPr>
+          <w:lang w:val="en-US"/>
+        </w:rPr>
+      </w:pPr>
     </w:p>
     <w:p>
       <w:pPr>

</xml_diff>